<commit_message>
changing the Backlog file in the documents\Main Documents folder
</commit_message>
<xml_diff>
--- a/documents/Основные документы/Backlog.docx
+++ b/documents/Основные документы/Backlog.docx
@@ -1,6 +1,6 @@
 
 <file path=word/document.xml><?xml version="1.0" encoding="utf-8"?>
-<w:document xmlns:wpc="http://schemas.microsoft.com/office/word/2010/wordprocessingCanvas" xmlns:cx="http://schemas.microsoft.com/office/drawing/2014/chartex" xmlns:cx1="http://schemas.microsoft.com/office/drawing/2015/9/8/chartex" xmlns:mc="http://schemas.openxmlformats.org/markup-compatibility/2006" xmlns:o="urn:schemas-microsoft-com:office:office" xmlns:r="http://schemas.openxmlformats.org/officeDocument/2006/relationships" xmlns:m="http://schemas.openxmlformats.org/officeDocument/2006/math" xmlns:v="urn:schemas-microsoft-com:vml" xmlns:wp14="http://schemas.microsoft.com/office/word/2010/wordprocessingDrawing" xmlns:wp="http://schemas.openxmlformats.org/drawingml/2006/wordprocessingDrawing" xmlns:w10="urn:schemas-microsoft-com:office:word" xmlns:w="http://schemas.openxmlformats.org/wordprocessingml/2006/main" xmlns:w14="http://schemas.microsoft.com/office/word/2010/wordml" xmlns:w15="http://schemas.microsoft.com/office/word/2012/wordml" xmlns:w16se="http://schemas.microsoft.com/office/word/2015/wordml/symex" xmlns:wpg="http://schemas.microsoft.com/office/word/2010/wordprocessingGroup" xmlns:wpi="http://schemas.microsoft.com/office/word/2010/wordprocessingInk" xmlns:wne="http://schemas.microsoft.com/office/word/2006/wordml" xmlns:wps="http://schemas.microsoft.com/office/word/2010/wordprocessingShape" mc:Ignorable="w14 w15 w16se wp14">
+<w:document xmlns:wpc="http://schemas.microsoft.com/office/word/2010/wordprocessingCanvas" xmlns:cx="http://schemas.microsoft.com/office/drawing/2014/chartex" xmlns:cx1="http://schemas.microsoft.com/office/drawing/2015/9/8/chartex" xmlns:cx2="http://schemas.microsoft.com/office/drawing/2015/10/21/chartex" xmlns:cx3="http://schemas.microsoft.com/office/drawing/2016/5/9/chartex" xmlns:cx4="http://schemas.microsoft.com/office/drawing/2016/5/10/chartex" xmlns:cx5="http://schemas.microsoft.com/office/drawing/2016/5/11/chartex" xmlns:cx6="http://schemas.microsoft.com/office/drawing/2016/5/12/chartex" xmlns:cx7="http://schemas.microsoft.com/office/drawing/2016/5/13/chartex" xmlns:cx8="http://schemas.microsoft.com/office/drawing/2016/5/14/chartex" xmlns:mc="http://schemas.openxmlformats.org/markup-compatibility/2006" xmlns:aink="http://schemas.microsoft.com/office/drawing/2016/ink" xmlns:am3d="http://schemas.microsoft.com/office/drawing/2017/model3d" xmlns:o="urn:schemas-microsoft-com:office:office" xmlns:oel="http://schemas.microsoft.com/office/2019/extlst" xmlns:r="http://schemas.openxmlformats.org/officeDocument/2006/relationships" xmlns:m="http://schemas.openxmlformats.org/officeDocument/2006/math" xmlns:v="urn:schemas-microsoft-com:vml" xmlns:wp14="http://schemas.microsoft.com/office/word/2010/wordprocessingDrawing" xmlns:wp="http://schemas.openxmlformats.org/drawingml/2006/wordprocessingDrawing" xmlns:w10="urn:schemas-microsoft-com:office:word" xmlns:w="http://schemas.openxmlformats.org/wordprocessingml/2006/main" xmlns:w14="http://schemas.microsoft.com/office/word/2010/wordml" xmlns:w15="http://schemas.microsoft.com/office/word/2012/wordml" xmlns:w16cex="http://schemas.microsoft.com/office/word/2018/wordml/cex" xmlns:w16cid="http://schemas.microsoft.com/office/word/2016/wordml/cid" xmlns:w16="http://schemas.microsoft.com/office/word/2018/wordml" xmlns:w16du="http://schemas.microsoft.com/office/word/2023/wordml/word16du" xmlns:w16sdtdh="http://schemas.microsoft.com/office/word/2020/wordml/sdtdatahash" xmlns:w16sdtfl="http://schemas.microsoft.com/office/word/2024/wordml/sdtformatlock" xmlns:w16se="http://schemas.microsoft.com/office/word/2015/wordml/symex" xmlns:wpg="http://schemas.microsoft.com/office/word/2010/wordprocessingGroup" xmlns:wpi="http://schemas.microsoft.com/office/word/2010/wordprocessingInk" xmlns:wne="http://schemas.microsoft.com/office/word/2006/wordml" xmlns:wps="http://schemas.microsoft.com/office/word/2010/wordprocessingShape" mc:Ignorable="w14 w15 w16se w16cid w16 w16cex w16sdtdh w16sdtfl w16du wp14">
   <w:body>
     <w:p>
       <w:pPr>
@@ -53,8 +53,6 @@
         </w:rPr>
         <w:t>Период: 14.11.2025 — 29.11.2025</w:t>
       </w:r>
-      <w:bookmarkStart w:id="0" w:name="_GoBack"/>
-      <w:bookmarkEnd w:id="0"/>
     </w:p>
     <w:p>
       <w:pPr>
@@ -79,6 +77,42 @@
           <w:lang w:eastAsia="ru-RU"/>
         </w:rPr>
         <w:t>Задачи спринта:</w:t>
+      </w:r>
+    </w:p>
+    <w:p>
+      <w:pPr>
+        <w:spacing w:before="100" w:beforeAutospacing="1" w:after="100" w:afterAutospacing="1" w:line="240" w:lineRule="auto"/>
+        <w:outlineLvl w:val="1"/>
+        <w:rPr>
+          <w:rFonts w:ascii="Times New Roman" w:eastAsia="Times New Roman" w:hAnsi="Times New Roman" w:cs="Times New Roman"/>
+          <w:b/>
+          <w:bCs/>
+          <w:sz w:val="24"/>
+          <w:szCs w:val="24"/>
+          <w:lang w:eastAsia="ru-RU"/>
+        </w:rPr>
+      </w:pPr>
+      <w:r>
+        <w:rPr>
+          <w:rFonts w:ascii="Times New Roman" w:eastAsia="Times New Roman" w:hAnsi="Times New Roman" w:cs="Times New Roman"/>
+          <w:b/>
+          <w:bCs/>
+          <w:sz w:val="24"/>
+          <w:szCs w:val="24"/>
+          <w:lang w:eastAsia="ru-RU"/>
+        </w:rPr>
+        <w:t>Подготовка регистрации</w:t>
+      </w:r>
+      <w:r>
+        <w:rPr>
+          <w:rFonts w:ascii="Times New Roman" w:eastAsia="Times New Roman" w:hAnsi="Times New Roman" w:cs="Times New Roman"/>
+          <w:b/>
+          <w:bCs/>
+          <w:sz w:val="24"/>
+          <w:szCs w:val="24"/>
+          <w:lang w:eastAsia="ru-RU"/>
+        </w:rPr>
+        <w:t>.</w:t>
       </w:r>
     </w:p>
     <w:p>
@@ -130,27 +164,7 @@
           <w:szCs w:val="24"/>
           <w:lang w:eastAsia="ru-RU"/>
         </w:rPr>
-        <w:t xml:space="preserve">Подготовка </w:t>
-      </w:r>
-      <w:proofErr w:type="spellStart"/>
-      <w:r>
-        <w:rPr>
-          <w:rFonts w:ascii="Times New Roman" w:eastAsia="Times New Roman" w:hAnsi="Times New Roman" w:cs="Times New Roman"/>
-          <w:sz w:val="24"/>
-          <w:szCs w:val="24"/>
-          <w:lang w:eastAsia="ru-RU"/>
-        </w:rPr>
-        <w:t>Endpoints</w:t>
-      </w:r>
-      <w:proofErr w:type="spellEnd"/>
-      <w:r>
-        <w:rPr>
-          <w:rFonts w:ascii="Times New Roman" w:eastAsia="Times New Roman" w:hAnsi="Times New Roman" w:cs="Times New Roman"/>
-          <w:sz w:val="24"/>
-          <w:szCs w:val="24"/>
-          <w:lang w:eastAsia="ru-RU"/>
-        </w:rPr>
-        <w:t xml:space="preserve"> (базовый список, структура API)</w:t>
+        <w:t>Создание модели User</w:t>
       </w:r>
     </w:p>
     <w:p>
@@ -175,7 +189,7 @@
           <w:szCs w:val="24"/>
           <w:lang w:eastAsia="ru-RU"/>
         </w:rPr>
-        <w:t>Подготовка API документации и примеров запросов</w:t>
+        <w:t>Создание модели Address</w:t>
       </w:r>
     </w:p>
     <w:p>
@@ -200,7 +214,7 @@
           <w:szCs w:val="24"/>
           <w:lang w:eastAsia="ru-RU"/>
         </w:rPr>
-        <w:t xml:space="preserve">Настройка </w:t>
+        <w:t xml:space="preserve">Подготовка </w:t>
       </w:r>
       <w:proofErr w:type="spellStart"/>
       <w:r>
@@ -210,58 +224,255 @@
           <w:szCs w:val="24"/>
           <w:lang w:eastAsia="ru-RU"/>
         </w:rPr>
-        <w:t>password</w:t>
+        <w:t>Endpoints</w:t>
       </w:r>
       <w:proofErr w:type="spellEnd"/>
-      <w:r>
-        <w:rPr>
-          <w:rFonts w:ascii="Times New Roman" w:eastAsia="Times New Roman" w:hAnsi="Times New Roman" w:cs="Times New Roman"/>
-          <w:sz w:val="24"/>
-          <w:szCs w:val="24"/>
-          <w:lang w:eastAsia="ru-RU"/>
-        </w:rPr>
-        <w:t xml:space="preserve"> </w:t>
-      </w:r>
+    </w:p>
+    <w:p>
+      <w:pPr>
+        <w:pStyle w:val="a5"/>
+        <w:numPr>
+          <w:ilvl w:val="0"/>
+          <w:numId w:val="18"/>
+        </w:numPr>
+        <w:spacing w:before="100" w:beforeAutospacing="1" w:after="100" w:afterAutospacing="1" w:line="240" w:lineRule="auto"/>
+        <w:rPr>
+          <w:rFonts w:ascii="Times New Roman" w:eastAsia="Times New Roman" w:hAnsi="Times New Roman" w:cs="Times New Roman"/>
+          <w:sz w:val="24"/>
+          <w:szCs w:val="24"/>
+          <w:lang w:eastAsia="ru-RU"/>
+        </w:rPr>
+      </w:pPr>
+      <w:r>
+        <w:rPr>
+          <w:rFonts w:ascii="Times New Roman" w:eastAsia="Times New Roman" w:hAnsi="Times New Roman" w:cs="Times New Roman"/>
+          <w:sz w:val="24"/>
+          <w:szCs w:val="24"/>
+          <w:lang w:eastAsia="ru-RU"/>
+        </w:rPr>
+        <w:t>Обработка запросов регистрации пользователя</w:t>
+      </w:r>
+      <w:r>
+        <w:rPr>
+          <w:rFonts w:ascii="Times New Roman" w:eastAsia="Times New Roman" w:hAnsi="Times New Roman" w:cs="Times New Roman"/>
+          <w:sz w:val="24"/>
+          <w:szCs w:val="24"/>
+          <w:lang w:eastAsia="ru-RU"/>
+        </w:rPr>
+        <w:t> </w:t>
+      </w:r>
+    </w:p>
+    <w:p>
+      <w:pPr>
+        <w:spacing w:before="100" w:beforeAutospacing="1" w:after="100" w:afterAutospacing="1" w:line="240" w:lineRule="auto"/>
+        <w:outlineLvl w:val="2"/>
+        <w:rPr>
+          <w:rFonts w:ascii="Times New Roman" w:eastAsia="Times New Roman" w:hAnsi="Times New Roman" w:cs="Times New Roman"/>
+          <w:b/>
+          <w:bCs/>
+          <w:sz w:val="24"/>
+          <w:szCs w:val="24"/>
+          <w:lang w:eastAsia="ru-RU"/>
+        </w:rPr>
+      </w:pPr>
       <w:proofErr w:type="spellStart"/>
       <w:r>
         <w:rPr>
           <w:rFonts w:ascii="Times New Roman" w:eastAsia="Times New Roman" w:hAnsi="Times New Roman" w:cs="Times New Roman"/>
-          <w:sz w:val="24"/>
-          <w:szCs w:val="24"/>
-          <w:lang w:eastAsia="ru-RU"/>
-        </w:rPr>
-        <w:t>hashing</w:t>
+          <w:b/>
+          <w:bCs/>
+          <w:sz w:val="24"/>
+          <w:szCs w:val="24"/>
+          <w:lang w:eastAsia="ru-RU"/>
+        </w:rPr>
+        <w:t>Frontend</w:t>
       </w:r>
       <w:proofErr w:type="spellEnd"/>
-      <w:r>
-        <w:rPr>
-          <w:rFonts w:ascii="Times New Roman" w:eastAsia="Times New Roman" w:hAnsi="Times New Roman" w:cs="Times New Roman"/>
-          <w:sz w:val="24"/>
-          <w:szCs w:val="24"/>
-          <w:lang w:eastAsia="ru-RU"/>
-        </w:rPr>
-        <w:t xml:space="preserve"> (</w:t>
-      </w:r>
+    </w:p>
+    <w:p>
+      <w:pPr>
+        <w:pStyle w:val="a5"/>
+        <w:numPr>
+          <w:ilvl w:val="0"/>
+          <w:numId w:val="17"/>
+        </w:numPr>
+        <w:spacing w:before="100" w:beforeAutospacing="1" w:after="100" w:afterAutospacing="1" w:line="240" w:lineRule="auto"/>
+        <w:rPr>
+          <w:rFonts w:ascii="Times New Roman" w:eastAsia="Times New Roman" w:hAnsi="Times New Roman" w:cs="Times New Roman"/>
+          <w:sz w:val="24"/>
+          <w:szCs w:val="24"/>
+          <w:lang w:eastAsia="ru-RU"/>
+        </w:rPr>
+      </w:pPr>
+      <w:r>
+        <w:rPr>
+          <w:rFonts w:ascii="Times New Roman" w:eastAsia="Times New Roman" w:hAnsi="Times New Roman" w:cs="Times New Roman"/>
+          <w:sz w:val="24"/>
+          <w:szCs w:val="24"/>
+          <w:lang w:eastAsia="ru-RU"/>
+        </w:rPr>
+        <w:t xml:space="preserve">Верстка страницы регистрации </w:t>
+      </w:r>
+    </w:p>
+    <w:p>
+      <w:pPr>
+        <w:pStyle w:val="a5"/>
+        <w:numPr>
+          <w:ilvl w:val="1"/>
+          <w:numId w:val="17"/>
+        </w:numPr>
+        <w:spacing w:before="100" w:beforeAutospacing="1" w:after="100" w:afterAutospacing="1" w:line="240" w:lineRule="auto"/>
+        <w:rPr>
+          <w:rFonts w:ascii="Times New Roman" w:eastAsia="Times New Roman" w:hAnsi="Times New Roman" w:cs="Times New Roman"/>
+          <w:sz w:val="24"/>
+          <w:szCs w:val="24"/>
+          <w:lang w:eastAsia="ru-RU"/>
+        </w:rPr>
+      </w:pPr>
+      <w:r>
+        <w:rPr>
+          <w:rFonts w:ascii="Times New Roman" w:eastAsia="Times New Roman" w:hAnsi="Times New Roman" w:cs="Times New Roman"/>
+          <w:sz w:val="24"/>
+          <w:szCs w:val="24"/>
+          <w:lang w:eastAsia="ru-RU"/>
+        </w:rPr>
+        <w:t>Поля ввода почты, пароля, восстановления пароля</w:t>
+      </w:r>
+    </w:p>
+    <w:p>
+      <w:pPr>
+        <w:pStyle w:val="a5"/>
+        <w:numPr>
+          <w:ilvl w:val="1"/>
+          <w:numId w:val="17"/>
+        </w:numPr>
+        <w:spacing w:before="100" w:beforeAutospacing="1" w:after="100" w:afterAutospacing="1" w:line="240" w:lineRule="auto"/>
+        <w:rPr>
+          <w:rFonts w:ascii="Times New Roman" w:eastAsia="Times New Roman" w:hAnsi="Times New Roman" w:cs="Times New Roman"/>
+          <w:sz w:val="24"/>
+          <w:szCs w:val="24"/>
+          <w:lang w:eastAsia="ru-RU"/>
+        </w:rPr>
+      </w:pPr>
+      <w:r>
+        <w:rPr>
+          <w:rFonts w:ascii="Times New Roman" w:eastAsia="Times New Roman" w:hAnsi="Times New Roman" w:cs="Times New Roman"/>
+          <w:sz w:val="24"/>
+          <w:szCs w:val="24"/>
+          <w:lang w:eastAsia="ru-RU"/>
+        </w:rPr>
+        <w:t>Ссылки восстановления пароля</w:t>
+      </w:r>
+    </w:p>
+    <w:p>
+      <w:pPr>
+        <w:spacing w:before="100" w:beforeAutospacing="1" w:after="100" w:afterAutospacing="1" w:line="240" w:lineRule="auto"/>
+        <w:outlineLvl w:val="2"/>
+        <w:rPr>
+          <w:rFonts w:ascii="Times New Roman" w:eastAsia="Times New Roman" w:hAnsi="Times New Roman" w:cs="Times New Roman"/>
+          <w:b/>
+          <w:bCs/>
+          <w:sz w:val="24"/>
+          <w:szCs w:val="24"/>
+          <w:lang w:eastAsia="ru-RU"/>
+        </w:rPr>
+      </w:pPr>
+      <w:r>
+        <w:rPr>
+          <w:rFonts w:ascii="Times New Roman" w:eastAsia="Times New Roman" w:hAnsi="Times New Roman" w:cs="Times New Roman"/>
+          <w:b/>
+          <w:bCs/>
+          <w:sz w:val="24"/>
+          <w:szCs w:val="24"/>
+          <w:lang w:eastAsia="ru-RU"/>
+        </w:rPr>
+        <w:t>Аналитик</w:t>
+      </w:r>
+    </w:p>
+    <w:p>
+      <w:pPr>
+        <w:pStyle w:val="a5"/>
+        <w:numPr>
+          <w:ilvl w:val="0"/>
+          <w:numId w:val="17"/>
+        </w:numPr>
+        <w:spacing w:before="100" w:beforeAutospacing="1" w:after="100" w:afterAutospacing="1" w:line="240" w:lineRule="auto"/>
+        <w:rPr>
+          <w:rFonts w:ascii="Times New Roman" w:eastAsia="Times New Roman" w:hAnsi="Times New Roman" w:cs="Times New Roman"/>
+          <w:sz w:val="24"/>
+          <w:szCs w:val="24"/>
+          <w:lang w:eastAsia="ru-RU"/>
+        </w:rPr>
+      </w:pPr>
+      <w:r>
+        <w:rPr>
+          <w:rFonts w:ascii="Times New Roman" w:eastAsia="Times New Roman" w:hAnsi="Times New Roman" w:cs="Times New Roman"/>
+          <w:sz w:val="24"/>
+          <w:szCs w:val="24"/>
+          <w:lang w:eastAsia="ru-RU"/>
+        </w:rPr>
+        <w:t>Подготовка описания сущностей: User, Address</w:t>
+      </w:r>
+    </w:p>
+    <w:p>
+      <w:pPr>
+        <w:spacing w:before="100" w:beforeAutospacing="1" w:after="100" w:afterAutospacing="1" w:line="240" w:lineRule="auto"/>
+        <w:rPr>
+          <w:rFonts w:ascii="Times New Roman" w:eastAsia="Times New Roman" w:hAnsi="Times New Roman" w:cs="Times New Roman"/>
+          <w:sz w:val="24"/>
+          <w:szCs w:val="24"/>
+          <w:lang w:eastAsia="ru-RU"/>
+        </w:rPr>
+      </w:pPr>
+    </w:p>
+    <w:p>
+      <w:pPr>
+        <w:spacing w:before="100" w:beforeAutospacing="1" w:after="100" w:afterAutospacing="1" w:line="240" w:lineRule="auto"/>
+        <w:rPr>
+          <w:rFonts w:ascii="Times New Roman" w:eastAsia="Times New Roman" w:hAnsi="Times New Roman" w:cs="Times New Roman"/>
+          <w:sz w:val="24"/>
+          <w:szCs w:val="24"/>
+          <w:lang w:eastAsia="ru-RU"/>
+        </w:rPr>
+      </w:pPr>
+      <w:r>
+        <w:rPr>
+          <w:rFonts w:ascii="Times New Roman" w:eastAsia="Times New Roman" w:hAnsi="Times New Roman" w:cs="Times New Roman"/>
+          <w:b/>
+          <w:bCs/>
+          <w:sz w:val="24"/>
+          <w:szCs w:val="24"/>
+          <w:lang w:eastAsia="ru-RU"/>
+        </w:rPr>
+        <w:t>Подготовка авторизации:</w:t>
+      </w:r>
+    </w:p>
+    <w:p>
+      <w:pPr>
+        <w:spacing w:before="100" w:beforeAutospacing="1" w:after="100" w:afterAutospacing="1" w:line="240" w:lineRule="auto"/>
+        <w:outlineLvl w:val="2"/>
+        <w:rPr>
+          <w:rFonts w:ascii="Times New Roman" w:eastAsia="Times New Roman" w:hAnsi="Times New Roman" w:cs="Times New Roman"/>
+          <w:b/>
+          <w:bCs/>
+          <w:sz w:val="24"/>
+          <w:szCs w:val="24"/>
+          <w:lang w:eastAsia="ru-RU"/>
+        </w:rPr>
+      </w:pPr>
       <w:proofErr w:type="spellStart"/>
       <w:r>
         <w:rPr>
           <w:rFonts w:ascii="Times New Roman" w:eastAsia="Times New Roman" w:hAnsi="Times New Roman" w:cs="Times New Roman"/>
-          <w:sz w:val="24"/>
-          <w:szCs w:val="24"/>
-          <w:lang w:eastAsia="ru-RU"/>
-        </w:rPr>
-        <w:t>bcrypt</w:t>
+          <w:b/>
+          <w:bCs/>
+          <w:sz w:val="24"/>
+          <w:szCs w:val="24"/>
+          <w:lang w:eastAsia="ru-RU"/>
+        </w:rPr>
+        <w:t>Backend</w:t>
       </w:r>
       <w:proofErr w:type="spellEnd"/>
-      <w:r>
-        <w:rPr>
-          <w:rFonts w:ascii="Times New Roman" w:eastAsia="Times New Roman" w:hAnsi="Times New Roman" w:cs="Times New Roman"/>
-          <w:sz w:val="24"/>
-          <w:szCs w:val="24"/>
-          <w:lang w:eastAsia="ru-RU"/>
-        </w:rPr>
-        <w:t>)</w:t>
-      </w:r>
     </w:p>
     <w:p>
       <w:pPr>
@@ -285,7 +496,7 @@
           <w:szCs w:val="24"/>
           <w:lang w:eastAsia="ru-RU"/>
         </w:rPr>
-        <w:t xml:space="preserve">Создание модели </w:t>
+        <w:t xml:space="preserve">Настройка </w:t>
       </w:r>
       <w:proofErr w:type="spellStart"/>
       <w:r>
@@ -295,9 +506,58 @@
           <w:szCs w:val="24"/>
           <w:lang w:eastAsia="ru-RU"/>
         </w:rPr>
-        <w:t>User</w:t>
+        <w:t>password</w:t>
       </w:r>
       <w:proofErr w:type="spellEnd"/>
+      <w:r>
+        <w:rPr>
+          <w:rFonts w:ascii="Times New Roman" w:eastAsia="Times New Roman" w:hAnsi="Times New Roman" w:cs="Times New Roman"/>
+          <w:sz w:val="24"/>
+          <w:szCs w:val="24"/>
+          <w:lang w:eastAsia="ru-RU"/>
+        </w:rPr>
+        <w:t xml:space="preserve"> </w:t>
+      </w:r>
+      <w:proofErr w:type="spellStart"/>
+      <w:r>
+        <w:rPr>
+          <w:rFonts w:ascii="Times New Roman" w:eastAsia="Times New Roman" w:hAnsi="Times New Roman" w:cs="Times New Roman"/>
+          <w:sz w:val="24"/>
+          <w:szCs w:val="24"/>
+          <w:lang w:eastAsia="ru-RU"/>
+        </w:rPr>
+        <w:t>hashing</w:t>
+      </w:r>
+      <w:proofErr w:type="spellEnd"/>
+      <w:r>
+        <w:rPr>
+          <w:rFonts w:ascii="Times New Roman" w:eastAsia="Times New Roman" w:hAnsi="Times New Roman" w:cs="Times New Roman"/>
+          <w:sz w:val="24"/>
+          <w:szCs w:val="24"/>
+          <w:lang w:eastAsia="ru-RU"/>
+        </w:rPr>
+        <w:t xml:space="preserve"> (</w:t>
+      </w:r>
+      <w:proofErr w:type="spellStart"/>
+      <w:r>
+        <w:rPr>
+          <w:rFonts w:ascii="Times New Roman" w:eastAsia="Times New Roman" w:hAnsi="Times New Roman" w:cs="Times New Roman"/>
+          <w:sz w:val="24"/>
+          <w:szCs w:val="24"/>
+          <w:lang w:eastAsia="ru-RU"/>
+        </w:rPr>
+        <w:t>bcrypt</w:t>
+      </w:r>
+      <w:proofErr w:type="spellEnd"/>
+      <w:r>
+        <w:rPr>
+          <w:rFonts w:ascii="Times New Roman" w:eastAsia="Times New Roman" w:hAnsi="Times New Roman" w:cs="Times New Roman"/>
+          <w:sz w:val="24"/>
+          <w:szCs w:val="24"/>
+          <w:lang w:eastAsia="ru-RU"/>
+        </w:rPr>
+        <w:t>)</w:t>
+      </w:r>
     </w:p>
     <w:p>
       <w:pPr>
@@ -321,7 +581,7 @@
           <w:szCs w:val="24"/>
           <w:lang w:eastAsia="ru-RU"/>
         </w:rPr>
-        <w:t xml:space="preserve">Создание модели </w:t>
+        <w:t xml:space="preserve">Подготовка </w:t>
       </w:r>
       <w:proofErr w:type="spellStart"/>
       <w:r>
@@ -331,9 +591,168 @@
           <w:szCs w:val="24"/>
           <w:lang w:eastAsia="ru-RU"/>
         </w:rPr>
-        <w:t>Address</w:t>
+        <w:t>Endpoints</w:t>
       </w:r>
       <w:proofErr w:type="spellEnd"/>
+      <w:r>
+        <w:rPr>
+          <w:rFonts w:ascii="Times New Roman" w:eastAsia="Times New Roman" w:hAnsi="Times New Roman" w:cs="Times New Roman"/>
+          <w:sz w:val="24"/>
+          <w:szCs w:val="24"/>
+          <w:lang w:eastAsia="ru-RU"/>
+        </w:rPr>
+        <w:t>\</w:t>
+      </w:r>
+    </w:p>
+    <w:p>
+      <w:pPr>
+        <w:pStyle w:val="a5"/>
+        <w:numPr>
+          <w:ilvl w:val="0"/>
+          <w:numId w:val="18"/>
+        </w:numPr>
+        <w:spacing w:before="100" w:beforeAutospacing="1" w:after="100" w:afterAutospacing="1" w:line="240" w:lineRule="auto"/>
+        <w:rPr>
+          <w:rFonts w:ascii="Times New Roman" w:eastAsia="Times New Roman" w:hAnsi="Times New Roman" w:cs="Times New Roman"/>
+          <w:sz w:val="24"/>
+          <w:szCs w:val="24"/>
+          <w:lang w:eastAsia="ru-RU"/>
+        </w:rPr>
+      </w:pPr>
+      <w:r>
+        <w:rPr>
+          <w:rFonts w:ascii="Times New Roman" w:eastAsia="Times New Roman" w:hAnsi="Times New Roman" w:cs="Times New Roman"/>
+          <w:sz w:val="24"/>
+          <w:szCs w:val="24"/>
+          <w:lang w:eastAsia="ru-RU"/>
+        </w:rPr>
+        <w:t>Вход пользователя в систему</w:t>
+      </w:r>
+    </w:p>
+    <w:p>
+      <w:pPr>
+        <w:pStyle w:val="a5"/>
+        <w:numPr>
+          <w:ilvl w:val="0"/>
+          <w:numId w:val="18"/>
+        </w:numPr>
+        <w:spacing w:before="100" w:beforeAutospacing="1" w:after="100" w:afterAutospacing="1" w:line="240" w:lineRule="auto"/>
+        <w:rPr>
+          <w:rFonts w:ascii="Times New Roman" w:eastAsia="Times New Roman" w:hAnsi="Times New Roman" w:cs="Times New Roman"/>
+          <w:sz w:val="24"/>
+          <w:szCs w:val="24"/>
+          <w:lang w:eastAsia="ru-RU"/>
+        </w:rPr>
+      </w:pPr>
+      <w:r>
+        <w:rPr>
+          <w:rFonts w:ascii="Times New Roman" w:eastAsia="Times New Roman" w:hAnsi="Times New Roman" w:cs="Times New Roman"/>
+          <w:sz w:val="24"/>
+          <w:szCs w:val="24"/>
+          <w:lang w:eastAsia="ru-RU"/>
+        </w:rPr>
+        <w:t>Изменение пароля пользователя</w:t>
+      </w:r>
+    </w:p>
+    <w:p>
+      <w:pPr>
+        <w:pStyle w:val="a5"/>
+        <w:numPr>
+          <w:ilvl w:val="0"/>
+          <w:numId w:val="18"/>
+        </w:numPr>
+        <w:spacing w:before="100" w:beforeAutospacing="1" w:after="100" w:afterAutospacing="1" w:line="240" w:lineRule="auto"/>
+        <w:rPr>
+          <w:rFonts w:ascii="Times New Roman" w:eastAsia="Times New Roman" w:hAnsi="Times New Roman" w:cs="Times New Roman"/>
+          <w:sz w:val="24"/>
+          <w:szCs w:val="24"/>
+          <w:lang w:eastAsia="ru-RU"/>
+        </w:rPr>
+      </w:pPr>
+      <w:r>
+        <w:rPr>
+          <w:rFonts w:ascii="Times New Roman" w:eastAsia="Times New Roman" w:hAnsi="Times New Roman" w:cs="Times New Roman"/>
+          <w:sz w:val="24"/>
+          <w:szCs w:val="24"/>
+          <w:lang w:eastAsia="ru-RU"/>
+        </w:rPr>
+        <w:t>Изменение данных пользователя</w:t>
+      </w:r>
+    </w:p>
+    <w:p>
+      <w:pPr>
+        <w:pStyle w:val="a5"/>
+        <w:numPr>
+          <w:ilvl w:val="0"/>
+          <w:numId w:val="18"/>
+        </w:numPr>
+        <w:spacing w:before="100" w:beforeAutospacing="1" w:after="100" w:afterAutospacing="1" w:line="240" w:lineRule="auto"/>
+        <w:rPr>
+          <w:rFonts w:ascii="Times New Roman" w:eastAsia="Times New Roman" w:hAnsi="Times New Roman" w:cs="Times New Roman"/>
+          <w:sz w:val="24"/>
+          <w:szCs w:val="24"/>
+          <w:lang w:eastAsia="ru-RU"/>
+        </w:rPr>
+      </w:pPr>
+      <w:r>
+        <w:rPr>
+          <w:rFonts w:ascii="Times New Roman" w:eastAsia="Times New Roman" w:hAnsi="Times New Roman" w:cs="Times New Roman"/>
+          <w:sz w:val="24"/>
+          <w:szCs w:val="24"/>
+          <w:lang w:eastAsia="ru-RU"/>
+        </w:rPr>
+        <w:t>Получение данных о пользователе</w:t>
+      </w:r>
+    </w:p>
+    <w:p>
+      <w:pPr>
+        <w:pStyle w:val="a5"/>
+        <w:numPr>
+          <w:ilvl w:val="0"/>
+          <w:numId w:val="18"/>
+        </w:numPr>
+        <w:spacing w:before="100" w:beforeAutospacing="1" w:after="100" w:afterAutospacing="1" w:line="240" w:lineRule="auto"/>
+        <w:rPr>
+          <w:rFonts w:ascii="Times New Roman" w:eastAsia="Times New Roman" w:hAnsi="Times New Roman" w:cs="Times New Roman"/>
+          <w:sz w:val="24"/>
+          <w:szCs w:val="24"/>
+          <w:lang w:eastAsia="ru-RU"/>
+        </w:rPr>
+      </w:pPr>
+      <w:r>
+        <w:rPr>
+          <w:rFonts w:ascii="Times New Roman" w:eastAsia="Times New Roman" w:hAnsi="Times New Roman" w:cs="Times New Roman"/>
+          <w:sz w:val="24"/>
+          <w:szCs w:val="24"/>
+          <w:lang w:eastAsia="ru-RU"/>
+        </w:rPr>
+        <w:t>Создание нового адреса пользователя</w:t>
+      </w:r>
+    </w:p>
+    <w:p>
+      <w:pPr>
+        <w:pStyle w:val="a5"/>
+        <w:numPr>
+          <w:ilvl w:val="0"/>
+          <w:numId w:val="18"/>
+        </w:numPr>
+        <w:spacing w:before="100" w:beforeAutospacing="1" w:after="100" w:afterAutospacing="1" w:line="240" w:lineRule="auto"/>
+        <w:rPr>
+          <w:rFonts w:ascii="Times New Roman" w:eastAsia="Times New Roman" w:hAnsi="Times New Roman" w:cs="Times New Roman"/>
+          <w:sz w:val="24"/>
+          <w:szCs w:val="24"/>
+          <w:lang w:eastAsia="ru-RU"/>
+        </w:rPr>
+      </w:pPr>
+      <w:r>
+        <w:rPr>
+          <w:rFonts w:ascii="Times New Roman" w:eastAsia="Times New Roman" w:hAnsi="Times New Roman" w:cs="Times New Roman"/>
+          <w:sz w:val="24"/>
+          <w:szCs w:val="24"/>
+          <w:lang w:eastAsia="ru-RU"/>
+        </w:rPr>
+        <w:t>Удаление адреса пользователя</w:t>
+      </w:r>
     </w:p>
     <w:p>
       <w:pPr>
@@ -384,32 +803,125 @@
           <w:szCs w:val="24"/>
           <w:lang w:eastAsia="ru-RU"/>
         </w:rPr>
-        <w:t>Верстка первых страниц</w:t>
+        <w:t>Верстка</w:t>
+      </w:r>
+      <w:r>
+        <w:rPr>
+          <w:rFonts w:ascii="Times New Roman" w:eastAsia="Times New Roman" w:hAnsi="Times New Roman" w:cs="Times New Roman"/>
+          <w:sz w:val="24"/>
+          <w:szCs w:val="24"/>
+          <w:lang w:val="en-US" w:eastAsia="ru-RU"/>
+        </w:rPr>
+        <w:t xml:space="preserve"> </w:t>
+      </w:r>
+      <w:r>
+        <w:rPr>
+          <w:rFonts w:ascii="Times New Roman" w:eastAsia="Times New Roman" w:hAnsi="Times New Roman" w:cs="Times New Roman"/>
+          <w:sz w:val="24"/>
+          <w:szCs w:val="24"/>
+          <w:lang w:eastAsia="ru-RU"/>
+        </w:rPr>
+        <w:t xml:space="preserve">главной страницы </w:t>
       </w:r>
     </w:p>
     <w:p>
       <w:pPr>
+        <w:pStyle w:val="a5"/>
+        <w:numPr>
+          <w:ilvl w:val="1"/>
+          <w:numId w:val="17"/>
+        </w:numPr>
         <w:spacing w:before="100" w:beforeAutospacing="1" w:after="100" w:afterAutospacing="1" w:line="240" w:lineRule="auto"/>
-        <w:outlineLvl w:val="2"/>
-        <w:rPr>
-          <w:rFonts w:ascii="Times New Roman" w:eastAsia="Times New Roman" w:hAnsi="Times New Roman" w:cs="Times New Roman"/>
-          <w:b/>
-          <w:bCs/>
-          <w:sz w:val="24"/>
-          <w:szCs w:val="24"/>
-          <w:lang w:eastAsia="ru-RU"/>
-        </w:rPr>
-      </w:pPr>
-      <w:r>
-        <w:rPr>
-          <w:rFonts w:ascii="Times New Roman" w:eastAsia="Times New Roman" w:hAnsi="Times New Roman" w:cs="Times New Roman"/>
-          <w:b/>
-          <w:bCs/>
-          <w:sz w:val="24"/>
-          <w:szCs w:val="24"/>
-          <w:lang w:eastAsia="ru-RU"/>
-        </w:rPr>
-        <w:t>Аналитик</w:t>
+        <w:rPr>
+          <w:rFonts w:ascii="Times New Roman" w:eastAsia="Times New Roman" w:hAnsi="Times New Roman" w:cs="Times New Roman"/>
+          <w:sz w:val="24"/>
+          <w:szCs w:val="24"/>
+          <w:lang w:eastAsia="ru-RU"/>
+        </w:rPr>
+      </w:pPr>
+      <w:r>
+        <w:rPr>
+          <w:rFonts w:ascii="Times New Roman" w:eastAsia="Times New Roman" w:hAnsi="Times New Roman" w:cs="Times New Roman"/>
+          <w:sz w:val="24"/>
+          <w:szCs w:val="24"/>
+          <w:lang w:eastAsia="ru-RU"/>
+        </w:rPr>
+        <w:t xml:space="preserve">Каталог </w:t>
+      </w:r>
+    </w:p>
+    <w:p>
+      <w:pPr>
+        <w:pStyle w:val="a5"/>
+        <w:numPr>
+          <w:ilvl w:val="1"/>
+          <w:numId w:val="17"/>
+        </w:numPr>
+        <w:spacing w:before="100" w:beforeAutospacing="1" w:after="100" w:afterAutospacing="1" w:line="240" w:lineRule="auto"/>
+        <w:rPr>
+          <w:rFonts w:ascii="Times New Roman" w:eastAsia="Times New Roman" w:hAnsi="Times New Roman" w:cs="Times New Roman"/>
+          <w:sz w:val="24"/>
+          <w:szCs w:val="24"/>
+          <w:lang w:eastAsia="ru-RU"/>
+        </w:rPr>
+      </w:pPr>
+      <w:r>
+        <w:rPr>
+          <w:rFonts w:ascii="Times New Roman" w:eastAsia="Times New Roman" w:hAnsi="Times New Roman" w:cs="Times New Roman"/>
+          <w:sz w:val="24"/>
+          <w:szCs w:val="24"/>
+          <w:lang w:eastAsia="ru-RU"/>
+        </w:rPr>
+        <w:t>Блоги</w:t>
+      </w:r>
+    </w:p>
+    <w:p>
+      <w:pPr>
+        <w:pStyle w:val="a5"/>
+        <w:numPr>
+          <w:ilvl w:val="1"/>
+          <w:numId w:val="17"/>
+        </w:numPr>
+        <w:spacing w:before="100" w:beforeAutospacing="1" w:after="100" w:afterAutospacing="1" w:line="240" w:lineRule="auto"/>
+        <w:rPr>
+          <w:rFonts w:ascii="Times New Roman" w:eastAsia="Times New Roman" w:hAnsi="Times New Roman" w:cs="Times New Roman"/>
+          <w:sz w:val="24"/>
+          <w:szCs w:val="24"/>
+          <w:lang w:eastAsia="ru-RU"/>
+        </w:rPr>
+      </w:pPr>
+      <w:r>
+        <w:rPr>
+          <w:rFonts w:ascii="Times New Roman" w:eastAsia="Times New Roman" w:hAnsi="Times New Roman" w:cs="Times New Roman"/>
+          <w:sz w:val="24"/>
+          <w:szCs w:val="24"/>
+          <w:lang w:eastAsia="ru-RU"/>
+        </w:rPr>
+        <w:t>Контактная информация</w:t>
+      </w:r>
+    </w:p>
+    <w:p>
+      <w:pPr>
+        <w:pStyle w:val="a5"/>
+        <w:numPr>
+          <w:ilvl w:val="1"/>
+          <w:numId w:val="17"/>
+        </w:numPr>
+        <w:spacing w:before="100" w:beforeAutospacing="1" w:after="100" w:afterAutospacing="1" w:line="240" w:lineRule="auto"/>
+        <w:rPr>
+          <w:rFonts w:ascii="Times New Roman" w:eastAsia="Times New Roman" w:hAnsi="Times New Roman" w:cs="Times New Roman"/>
+          <w:sz w:val="24"/>
+          <w:szCs w:val="24"/>
+          <w:lang w:eastAsia="ru-RU"/>
+        </w:rPr>
+      </w:pPr>
+      <w:r>
+        <w:rPr>
+          <w:rFonts w:ascii="Times New Roman" w:eastAsia="Times New Roman" w:hAnsi="Times New Roman" w:cs="Times New Roman"/>
+          <w:sz w:val="24"/>
+          <w:szCs w:val="24"/>
+          <w:lang w:eastAsia="ru-RU"/>
+        </w:rPr>
+        <w:t>Поля обратной связи</w:t>
       </w:r>
     </w:p>
     <w:p>
@@ -434,82 +946,36 @@
           <w:szCs w:val="24"/>
           <w:lang w:eastAsia="ru-RU"/>
         </w:rPr>
-        <w:t xml:space="preserve">Подготовка описания сущностей: </w:t>
-      </w:r>
-      <w:proofErr w:type="spellStart"/>
-      <w:r>
-        <w:rPr>
-          <w:rFonts w:ascii="Times New Roman" w:eastAsia="Times New Roman" w:hAnsi="Times New Roman" w:cs="Times New Roman"/>
-          <w:sz w:val="24"/>
-          <w:szCs w:val="24"/>
-          <w:lang w:eastAsia="ru-RU"/>
-        </w:rPr>
-        <w:t>User</w:t>
-      </w:r>
-      <w:proofErr w:type="spellEnd"/>
-      <w:r>
-        <w:rPr>
-          <w:rFonts w:ascii="Times New Roman" w:eastAsia="Times New Roman" w:hAnsi="Times New Roman" w:cs="Times New Roman"/>
-          <w:sz w:val="24"/>
-          <w:szCs w:val="24"/>
-          <w:lang w:eastAsia="ru-RU"/>
-        </w:rPr>
-        <w:t xml:space="preserve">, </w:t>
-      </w:r>
-      <w:proofErr w:type="spellStart"/>
-      <w:r>
-        <w:rPr>
-          <w:rFonts w:ascii="Times New Roman" w:eastAsia="Times New Roman" w:hAnsi="Times New Roman" w:cs="Times New Roman"/>
-          <w:sz w:val="24"/>
-          <w:szCs w:val="24"/>
-          <w:lang w:eastAsia="ru-RU"/>
-        </w:rPr>
-        <w:t>Address</w:t>
-      </w:r>
-      <w:proofErr w:type="spellEnd"/>
-      <w:r>
-        <w:rPr>
-          <w:rFonts w:ascii="Times New Roman" w:eastAsia="Times New Roman" w:hAnsi="Times New Roman" w:cs="Times New Roman"/>
-          <w:sz w:val="24"/>
-          <w:szCs w:val="24"/>
-          <w:lang w:eastAsia="ru-RU"/>
-        </w:rPr>
-        <w:t xml:space="preserve">, </w:t>
-      </w:r>
-      <w:proofErr w:type="spellStart"/>
-      <w:r>
-        <w:rPr>
-          <w:rFonts w:ascii="Times New Roman" w:eastAsia="Times New Roman" w:hAnsi="Times New Roman" w:cs="Times New Roman"/>
-          <w:sz w:val="24"/>
-          <w:szCs w:val="24"/>
-          <w:lang w:eastAsia="ru-RU"/>
-        </w:rPr>
-        <w:t>Product</w:t>
-      </w:r>
-      <w:proofErr w:type="spellEnd"/>
-      <w:r>
-        <w:rPr>
-          <w:rFonts w:ascii="Times New Roman" w:eastAsia="Times New Roman" w:hAnsi="Times New Roman" w:cs="Times New Roman"/>
-          <w:sz w:val="24"/>
-          <w:szCs w:val="24"/>
-          <w:lang w:eastAsia="ru-RU"/>
-        </w:rPr>
-        <w:t xml:space="preserve">, </w:t>
-      </w:r>
-      <w:proofErr w:type="spellStart"/>
-      <w:r>
-        <w:rPr>
-          <w:rFonts w:ascii="Times New Roman" w:eastAsia="Times New Roman" w:hAnsi="Times New Roman" w:cs="Times New Roman"/>
-          <w:sz w:val="24"/>
-          <w:szCs w:val="24"/>
-          <w:lang w:eastAsia="ru-RU"/>
-        </w:rPr>
-        <w:t>Article</w:t>
-      </w:r>
-      <w:proofErr w:type="spellEnd"/>
+        <w:t>Верстка страницы авторизации</w:t>
+      </w:r>
     </w:p>
     <w:p>
       <w:pPr>
+        <w:pStyle w:val="a5"/>
+        <w:numPr>
+          <w:ilvl w:val="1"/>
+          <w:numId w:val="17"/>
+        </w:numPr>
+        <w:spacing w:before="100" w:beforeAutospacing="1" w:after="100" w:afterAutospacing="1" w:line="240" w:lineRule="auto"/>
+        <w:rPr>
+          <w:rFonts w:ascii="Times New Roman" w:eastAsia="Times New Roman" w:hAnsi="Times New Roman" w:cs="Times New Roman"/>
+          <w:sz w:val="24"/>
+          <w:szCs w:val="24"/>
+          <w:lang w:eastAsia="ru-RU"/>
+        </w:rPr>
+      </w:pPr>
+      <w:r>
+        <w:rPr>
+          <w:rFonts w:ascii="Times New Roman" w:eastAsia="Times New Roman" w:hAnsi="Times New Roman" w:cs="Times New Roman"/>
+          <w:sz w:val="24"/>
+          <w:szCs w:val="24"/>
+          <w:lang w:eastAsia="ru-RU"/>
+        </w:rPr>
+        <w:t>Поля ввода почты и пароля</w:t>
+      </w:r>
+    </w:p>
+    <w:p>
+      <w:pPr>
         <w:spacing w:before="100" w:beforeAutospacing="1" w:after="100" w:afterAutospacing="1" w:line="240" w:lineRule="auto"/>
         <w:outlineLvl w:val="2"/>
         <w:rPr>
@@ -521,7 +987,6 @@
           <w:lang w:eastAsia="ru-RU"/>
         </w:rPr>
       </w:pPr>
-      <w:proofErr w:type="spellStart"/>
       <w:r>
         <w:rPr>
           <w:rFonts w:ascii="Times New Roman" w:eastAsia="Times New Roman" w:hAnsi="Times New Roman" w:cs="Times New Roman"/>
@@ -531,9 +996,8 @@
           <w:szCs w:val="24"/>
           <w:lang w:eastAsia="ru-RU"/>
         </w:rPr>
-        <w:t>Тестировщик</w:t>
-      </w:r>
-      <w:proofErr w:type="spellEnd"/>
+        <w:t>Аналитик</w:t>
+      </w:r>
     </w:p>
     <w:p>
       <w:pPr>
@@ -557,7 +1021,8 @@
           <w:szCs w:val="24"/>
           <w:lang w:eastAsia="ru-RU"/>
         </w:rPr>
-        <w:t xml:space="preserve">Создание </w:t>
+        <w:lastRenderedPageBreak/>
+        <w:t xml:space="preserve">Подготовка описания сущностей: Product, </w:t>
       </w:r>
       <w:proofErr w:type="spellStart"/>
       <w:r>
@@ -567,9 +1032,34 @@
           <w:szCs w:val="24"/>
           <w:lang w:eastAsia="ru-RU"/>
         </w:rPr>
-        <w:t>чеклистов</w:t>
+        <w:t>Article</w:t>
       </w:r>
       <w:proofErr w:type="spellEnd"/>
+    </w:p>
+    <w:p>
+      <w:pPr>
+        <w:spacing w:before="100" w:beforeAutospacing="1" w:after="100" w:afterAutospacing="1" w:line="240" w:lineRule="auto"/>
+        <w:outlineLvl w:val="2"/>
+        <w:rPr>
+          <w:rFonts w:ascii="Times New Roman" w:eastAsia="Times New Roman" w:hAnsi="Times New Roman" w:cs="Times New Roman"/>
+          <w:b/>
+          <w:bCs/>
+          <w:sz w:val="24"/>
+          <w:szCs w:val="24"/>
+          <w:lang w:eastAsia="ru-RU"/>
+        </w:rPr>
+      </w:pPr>
+      <w:r>
+        <w:rPr>
+          <w:rFonts w:ascii="Times New Roman" w:eastAsia="Times New Roman" w:hAnsi="Times New Roman" w:cs="Times New Roman"/>
+          <w:b/>
+          <w:bCs/>
+          <w:sz w:val="24"/>
+          <w:szCs w:val="24"/>
+          <w:lang w:eastAsia="ru-RU"/>
+        </w:rPr>
+        <w:t>Тестировщик</w:t>
+      </w:r>
     </w:p>
     <w:p>
       <w:pPr>
@@ -593,7 +1083,7 @@
           <w:szCs w:val="24"/>
           <w:lang w:eastAsia="ru-RU"/>
         </w:rPr>
-        <w:t xml:space="preserve">Тестирование базовых </w:t>
+        <w:t xml:space="preserve">Создание </w:t>
       </w:r>
       <w:proofErr w:type="spellStart"/>
       <w:r>
@@ -603,7 +1093,7 @@
           <w:szCs w:val="24"/>
           <w:lang w:eastAsia="ru-RU"/>
         </w:rPr>
-        <w:t>endpoint’ов</w:t>
+        <w:t>чеклистов</w:t>
       </w:r>
       <w:proofErr w:type="spellEnd"/>
     </w:p>
@@ -667,1202 +1157,8 @@
           <w:lang w:eastAsia="ru-RU"/>
         </w:rPr>
       </w:pPr>
-      <w:r>
-        <w:rPr>
-          <w:rFonts w:ascii="Times New Roman" w:eastAsia="Times New Roman" w:hAnsi="Times New Roman" w:cs="Times New Roman"/>
-          <w:sz w:val="24"/>
-          <w:szCs w:val="24"/>
-          <w:lang w:eastAsia="ru-RU"/>
-        </w:rPr>
-        <w:pict>
-          <v:rect id="_x0000_i1064" style="width:0;height:1.5pt" o:hralign="center" o:hrstd="t" o:hr="t" fillcolor="#a0a0a0" stroked="f"/>
-        </w:pict>
-      </w:r>
     </w:p>
-    <w:p>
-      <w:pPr>
-        <w:spacing w:before="100" w:beforeAutospacing="1" w:after="100" w:afterAutospacing="1" w:line="240" w:lineRule="auto"/>
-        <w:outlineLvl w:val="0"/>
-        <w:rPr>
-          <w:rFonts w:ascii="Times New Roman" w:eastAsia="Times New Roman" w:hAnsi="Times New Roman" w:cs="Times New Roman"/>
-          <w:b/>
-          <w:bCs/>
-          <w:kern w:val="36"/>
-          <w:sz w:val="24"/>
-          <w:szCs w:val="24"/>
-          <w:lang w:eastAsia="ru-RU"/>
-        </w:rPr>
-      </w:pPr>
-      <w:r>
-        <w:rPr>
-          <w:rFonts w:ascii="Times New Roman" w:eastAsia="Times New Roman" w:hAnsi="Times New Roman" w:cs="Times New Roman"/>
-          <w:b/>
-          <w:bCs/>
-          <w:kern w:val="36"/>
-          <w:sz w:val="24"/>
-          <w:szCs w:val="24"/>
-          <w:lang w:eastAsia="ru-RU"/>
-        </w:rPr>
-        <w:t>СПРИНТ 2</w:t>
-      </w:r>
-    </w:p>
-    <w:p>
-      <w:pPr>
-        <w:spacing w:before="100" w:beforeAutospacing="1" w:after="100" w:afterAutospacing="1" w:line="240" w:lineRule="auto"/>
-        <w:outlineLvl w:val="2"/>
-        <w:rPr>
-          <w:rFonts w:ascii="Times New Roman" w:eastAsia="Times New Roman" w:hAnsi="Times New Roman" w:cs="Times New Roman"/>
-          <w:b/>
-          <w:bCs/>
-          <w:sz w:val="24"/>
-          <w:szCs w:val="24"/>
-          <w:lang w:eastAsia="ru-RU"/>
-        </w:rPr>
-      </w:pPr>
-      <w:r>
-        <w:rPr>
-          <w:rFonts w:ascii="Times New Roman" w:eastAsia="Times New Roman" w:hAnsi="Times New Roman" w:cs="Times New Roman"/>
-          <w:b/>
-          <w:bCs/>
-          <w:sz w:val="24"/>
-          <w:szCs w:val="24"/>
-          <w:lang w:eastAsia="ru-RU"/>
-        </w:rPr>
-        <w:t>Период: 30.11.2025 — 13.12.2025</w:t>
-      </w:r>
-    </w:p>
-    <w:p>
-      <w:pPr>
-        <w:spacing w:before="100" w:beforeAutospacing="1" w:after="100" w:afterAutospacing="1" w:line="240" w:lineRule="auto"/>
-        <w:outlineLvl w:val="1"/>
-        <w:rPr>
-          <w:rFonts w:ascii="Times New Roman" w:eastAsia="Times New Roman" w:hAnsi="Times New Roman" w:cs="Times New Roman"/>
-          <w:b/>
-          <w:bCs/>
-          <w:sz w:val="24"/>
-          <w:szCs w:val="24"/>
-          <w:lang w:eastAsia="ru-RU"/>
-        </w:rPr>
-      </w:pPr>
-      <w:r>
-        <w:rPr>
-          <w:rFonts w:ascii="Times New Roman" w:eastAsia="Times New Roman" w:hAnsi="Times New Roman" w:cs="Times New Roman"/>
-          <w:b/>
-          <w:bCs/>
-          <w:sz w:val="24"/>
-          <w:szCs w:val="24"/>
-          <w:lang w:eastAsia="ru-RU"/>
-        </w:rPr>
-        <w:t>Задачи спринта:</w:t>
-      </w:r>
-    </w:p>
-    <w:p>
-      <w:pPr>
-        <w:spacing w:before="100" w:beforeAutospacing="1" w:after="100" w:afterAutospacing="1" w:line="240" w:lineRule="auto"/>
-        <w:outlineLvl w:val="2"/>
-        <w:rPr>
-          <w:rFonts w:ascii="Times New Roman" w:eastAsia="Times New Roman" w:hAnsi="Times New Roman" w:cs="Times New Roman"/>
-          <w:b/>
-          <w:bCs/>
-          <w:sz w:val="24"/>
-          <w:szCs w:val="24"/>
-          <w:lang w:eastAsia="ru-RU"/>
-        </w:rPr>
-      </w:pPr>
-      <w:proofErr w:type="spellStart"/>
-      <w:r>
-        <w:rPr>
-          <w:rFonts w:ascii="Times New Roman" w:eastAsia="Times New Roman" w:hAnsi="Times New Roman" w:cs="Times New Roman"/>
-          <w:b/>
-          <w:bCs/>
-          <w:sz w:val="24"/>
-          <w:szCs w:val="24"/>
-          <w:lang w:eastAsia="ru-RU"/>
-        </w:rPr>
-        <w:t>Backend</w:t>
-      </w:r>
-      <w:proofErr w:type="spellEnd"/>
-    </w:p>
-    <w:p>
-      <w:pPr>
-        <w:pStyle w:val="a5"/>
-        <w:numPr>
-          <w:ilvl w:val="0"/>
-          <w:numId w:val="17"/>
-        </w:numPr>
-        <w:spacing w:before="100" w:beforeAutospacing="1" w:after="100" w:afterAutospacing="1" w:line="240" w:lineRule="auto"/>
-        <w:rPr>
-          <w:rFonts w:ascii="Times New Roman" w:eastAsia="Times New Roman" w:hAnsi="Times New Roman" w:cs="Times New Roman"/>
-          <w:sz w:val="24"/>
-          <w:szCs w:val="24"/>
-          <w:lang w:eastAsia="ru-RU"/>
-        </w:rPr>
-      </w:pPr>
-      <w:r>
-        <w:rPr>
-          <w:rFonts w:ascii="Times New Roman" w:eastAsia="Times New Roman" w:hAnsi="Times New Roman" w:cs="Times New Roman"/>
-          <w:sz w:val="24"/>
-          <w:szCs w:val="24"/>
-          <w:lang w:eastAsia="ru-RU"/>
-        </w:rPr>
-        <w:t xml:space="preserve">Создание модели </w:t>
-      </w:r>
-      <w:proofErr w:type="spellStart"/>
-      <w:r>
-        <w:rPr>
-          <w:rFonts w:ascii="Times New Roman" w:eastAsia="Times New Roman" w:hAnsi="Times New Roman" w:cs="Times New Roman"/>
-          <w:sz w:val="24"/>
-          <w:szCs w:val="24"/>
-          <w:lang w:eastAsia="ru-RU"/>
-        </w:rPr>
-        <w:t>Product</w:t>
-      </w:r>
-      <w:proofErr w:type="spellEnd"/>
-    </w:p>
-    <w:p>
-      <w:pPr>
-        <w:pStyle w:val="a5"/>
-        <w:numPr>
-          <w:ilvl w:val="0"/>
-          <w:numId w:val="17"/>
-        </w:numPr>
-        <w:spacing w:before="100" w:beforeAutospacing="1" w:after="100" w:afterAutospacing="1" w:line="240" w:lineRule="auto"/>
-        <w:rPr>
-          <w:rFonts w:ascii="Times New Roman" w:eastAsia="Times New Roman" w:hAnsi="Times New Roman" w:cs="Times New Roman"/>
-          <w:sz w:val="24"/>
-          <w:szCs w:val="24"/>
-          <w:lang w:eastAsia="ru-RU"/>
-        </w:rPr>
-      </w:pPr>
-      <w:r>
-        <w:rPr>
-          <w:rFonts w:ascii="Times New Roman" w:eastAsia="Times New Roman" w:hAnsi="Times New Roman" w:cs="Times New Roman"/>
-          <w:sz w:val="24"/>
-          <w:szCs w:val="24"/>
-          <w:lang w:eastAsia="ru-RU"/>
-        </w:rPr>
-        <w:t xml:space="preserve">Создание модели </w:t>
-      </w:r>
-      <w:proofErr w:type="spellStart"/>
-      <w:r>
-        <w:rPr>
-          <w:rFonts w:ascii="Times New Roman" w:eastAsia="Times New Roman" w:hAnsi="Times New Roman" w:cs="Times New Roman"/>
-          <w:sz w:val="24"/>
-          <w:szCs w:val="24"/>
-          <w:lang w:eastAsia="ru-RU"/>
-        </w:rPr>
-        <w:t>Article</w:t>
-      </w:r>
-      <w:proofErr w:type="spellEnd"/>
-    </w:p>
-    <w:p>
-      <w:pPr>
-        <w:pStyle w:val="a5"/>
-        <w:numPr>
-          <w:ilvl w:val="0"/>
-          <w:numId w:val="17"/>
-        </w:numPr>
-        <w:spacing w:before="100" w:beforeAutospacing="1" w:after="100" w:afterAutospacing="1" w:line="240" w:lineRule="auto"/>
-        <w:rPr>
-          <w:rFonts w:ascii="Times New Roman" w:eastAsia="Times New Roman" w:hAnsi="Times New Roman" w:cs="Times New Roman"/>
-          <w:sz w:val="24"/>
-          <w:szCs w:val="24"/>
-          <w:lang w:eastAsia="ru-RU"/>
-        </w:rPr>
-      </w:pPr>
-      <w:r>
-        <w:rPr>
-          <w:rFonts w:ascii="Times New Roman" w:eastAsia="Times New Roman" w:hAnsi="Times New Roman" w:cs="Times New Roman"/>
-          <w:sz w:val="24"/>
-          <w:szCs w:val="24"/>
-          <w:lang w:eastAsia="ru-RU"/>
-        </w:rPr>
-        <w:t xml:space="preserve">Реализация </w:t>
-      </w:r>
-      <w:proofErr w:type="spellStart"/>
-      <w:r>
-        <w:rPr>
-          <w:rFonts w:ascii="Times New Roman" w:eastAsia="Times New Roman" w:hAnsi="Times New Roman" w:cs="Times New Roman"/>
-          <w:sz w:val="24"/>
-          <w:szCs w:val="24"/>
-          <w:lang w:eastAsia="ru-RU"/>
-        </w:rPr>
-        <w:t>Endpoints</w:t>
-      </w:r>
-      <w:proofErr w:type="spellEnd"/>
-      <w:r>
-        <w:rPr>
-          <w:rFonts w:ascii="Times New Roman" w:eastAsia="Times New Roman" w:hAnsi="Times New Roman" w:cs="Times New Roman"/>
-          <w:sz w:val="24"/>
-          <w:szCs w:val="24"/>
-          <w:lang w:eastAsia="ru-RU"/>
-        </w:rPr>
-        <w:t xml:space="preserve"> для товаров и статей</w:t>
-      </w:r>
-    </w:p>
-    <w:p>
-      <w:pPr>
-        <w:spacing w:before="100" w:beforeAutospacing="1" w:after="100" w:afterAutospacing="1" w:line="240" w:lineRule="auto"/>
-        <w:outlineLvl w:val="2"/>
-        <w:rPr>
-          <w:rFonts w:ascii="Times New Roman" w:eastAsia="Times New Roman" w:hAnsi="Times New Roman" w:cs="Times New Roman"/>
-          <w:b/>
-          <w:bCs/>
-          <w:sz w:val="24"/>
-          <w:szCs w:val="24"/>
-          <w:lang w:eastAsia="ru-RU"/>
-        </w:rPr>
-      </w:pPr>
-      <w:proofErr w:type="spellStart"/>
-      <w:r>
-        <w:rPr>
-          <w:rFonts w:ascii="Times New Roman" w:eastAsia="Times New Roman" w:hAnsi="Times New Roman" w:cs="Times New Roman"/>
-          <w:b/>
-          <w:bCs/>
-          <w:sz w:val="24"/>
-          <w:szCs w:val="24"/>
-          <w:lang w:eastAsia="ru-RU"/>
-        </w:rPr>
-        <w:t>Frontend</w:t>
-      </w:r>
-      <w:proofErr w:type="spellEnd"/>
-    </w:p>
-    <w:p>
-      <w:pPr>
-        <w:pStyle w:val="a5"/>
-        <w:numPr>
-          <w:ilvl w:val="0"/>
-          <w:numId w:val="17"/>
-        </w:numPr>
-        <w:spacing w:before="100" w:beforeAutospacing="1" w:after="100" w:afterAutospacing="1" w:line="240" w:lineRule="auto"/>
-        <w:rPr>
-          <w:rFonts w:ascii="Times New Roman" w:eastAsia="Times New Roman" w:hAnsi="Times New Roman" w:cs="Times New Roman"/>
-          <w:sz w:val="24"/>
-          <w:szCs w:val="24"/>
-          <w:lang w:eastAsia="ru-RU"/>
-        </w:rPr>
-      </w:pPr>
-      <w:r>
-        <w:rPr>
-          <w:rFonts w:ascii="Times New Roman" w:eastAsia="Times New Roman" w:hAnsi="Times New Roman" w:cs="Times New Roman"/>
-          <w:sz w:val="24"/>
-          <w:szCs w:val="24"/>
-          <w:lang w:eastAsia="ru-RU"/>
-        </w:rPr>
-        <w:t>Разработка страницы товаров</w:t>
-      </w:r>
-    </w:p>
-    <w:p>
-      <w:pPr>
-        <w:pStyle w:val="a5"/>
-        <w:numPr>
-          <w:ilvl w:val="0"/>
-          <w:numId w:val="17"/>
-        </w:numPr>
-        <w:spacing w:before="100" w:beforeAutospacing="1" w:after="100" w:afterAutospacing="1" w:line="240" w:lineRule="auto"/>
-        <w:rPr>
-          <w:rFonts w:ascii="Times New Roman" w:eastAsia="Times New Roman" w:hAnsi="Times New Roman" w:cs="Times New Roman"/>
-          <w:sz w:val="24"/>
-          <w:szCs w:val="24"/>
-          <w:lang w:eastAsia="ru-RU"/>
-        </w:rPr>
-      </w:pPr>
-      <w:r>
-        <w:rPr>
-          <w:rFonts w:ascii="Times New Roman" w:eastAsia="Times New Roman" w:hAnsi="Times New Roman" w:cs="Times New Roman"/>
-          <w:sz w:val="24"/>
-          <w:szCs w:val="24"/>
-          <w:lang w:eastAsia="ru-RU"/>
-        </w:rPr>
-        <w:t>Разработка карточки товара</w:t>
-      </w:r>
-    </w:p>
-    <w:p>
-      <w:pPr>
-        <w:pStyle w:val="a5"/>
-        <w:numPr>
-          <w:ilvl w:val="0"/>
-          <w:numId w:val="17"/>
-        </w:numPr>
-        <w:spacing w:before="100" w:beforeAutospacing="1" w:after="100" w:afterAutospacing="1" w:line="240" w:lineRule="auto"/>
-        <w:rPr>
-          <w:rFonts w:ascii="Times New Roman" w:eastAsia="Times New Roman" w:hAnsi="Times New Roman" w:cs="Times New Roman"/>
-          <w:sz w:val="24"/>
-          <w:szCs w:val="24"/>
-          <w:lang w:eastAsia="ru-RU"/>
-        </w:rPr>
-      </w:pPr>
-      <w:r>
-        <w:rPr>
-          <w:rFonts w:ascii="Times New Roman" w:eastAsia="Times New Roman" w:hAnsi="Times New Roman" w:cs="Times New Roman"/>
-          <w:sz w:val="24"/>
-          <w:szCs w:val="24"/>
-          <w:lang w:eastAsia="ru-RU"/>
-        </w:rPr>
-        <w:t>Разработка страницы статей</w:t>
-      </w:r>
-    </w:p>
-    <w:p>
-      <w:pPr>
-        <w:pStyle w:val="a5"/>
-        <w:numPr>
-          <w:ilvl w:val="0"/>
-          <w:numId w:val="17"/>
-        </w:numPr>
-        <w:spacing w:before="100" w:beforeAutospacing="1" w:after="100" w:afterAutospacing="1" w:line="240" w:lineRule="auto"/>
-        <w:rPr>
-          <w:rFonts w:ascii="Times New Roman" w:eastAsia="Times New Roman" w:hAnsi="Times New Roman" w:cs="Times New Roman"/>
-          <w:sz w:val="24"/>
-          <w:szCs w:val="24"/>
-          <w:lang w:eastAsia="ru-RU"/>
-        </w:rPr>
-      </w:pPr>
-      <w:r>
-        <w:rPr>
-          <w:rFonts w:ascii="Times New Roman" w:eastAsia="Times New Roman" w:hAnsi="Times New Roman" w:cs="Times New Roman"/>
-          <w:sz w:val="24"/>
-          <w:szCs w:val="24"/>
-          <w:lang w:eastAsia="ru-RU"/>
-        </w:rPr>
-        <w:t>Разработка страницы просмотра статьи</w:t>
-      </w:r>
-    </w:p>
-    <w:p>
-      <w:pPr>
-        <w:spacing w:before="100" w:beforeAutospacing="1" w:after="100" w:afterAutospacing="1" w:line="240" w:lineRule="auto"/>
-        <w:outlineLvl w:val="2"/>
-        <w:rPr>
-          <w:rFonts w:ascii="Times New Roman" w:eastAsia="Times New Roman" w:hAnsi="Times New Roman" w:cs="Times New Roman"/>
-          <w:b/>
-          <w:bCs/>
-          <w:sz w:val="24"/>
-          <w:szCs w:val="24"/>
-          <w:lang w:eastAsia="ru-RU"/>
-        </w:rPr>
-      </w:pPr>
-      <w:r>
-        <w:rPr>
-          <w:rFonts w:ascii="Times New Roman" w:eastAsia="Times New Roman" w:hAnsi="Times New Roman" w:cs="Times New Roman"/>
-          <w:b/>
-          <w:bCs/>
-          <w:sz w:val="24"/>
-          <w:szCs w:val="24"/>
-          <w:lang w:eastAsia="ru-RU"/>
-        </w:rPr>
-        <w:lastRenderedPageBreak/>
-        <w:t>Аналитик</w:t>
-      </w:r>
-    </w:p>
-    <w:p>
-      <w:pPr>
-        <w:pStyle w:val="a5"/>
-        <w:numPr>
-          <w:ilvl w:val="0"/>
-          <w:numId w:val="17"/>
-        </w:numPr>
-        <w:spacing w:before="100" w:beforeAutospacing="1" w:after="100" w:afterAutospacing="1" w:line="240" w:lineRule="auto"/>
-        <w:rPr>
-          <w:rFonts w:ascii="Times New Roman" w:eastAsia="Times New Roman" w:hAnsi="Times New Roman" w:cs="Times New Roman"/>
-          <w:sz w:val="24"/>
-          <w:szCs w:val="24"/>
-          <w:lang w:eastAsia="ru-RU"/>
-        </w:rPr>
-      </w:pPr>
-      <w:r>
-        <w:rPr>
-          <w:rFonts w:ascii="Times New Roman" w:eastAsia="Times New Roman" w:hAnsi="Times New Roman" w:cs="Times New Roman"/>
-          <w:sz w:val="24"/>
-          <w:szCs w:val="24"/>
-          <w:lang w:eastAsia="ru-RU"/>
-        </w:rPr>
-        <w:t>Подготовка API-контракта для товаров и статей</w:t>
-      </w:r>
-    </w:p>
-    <w:p>
-      <w:pPr>
-        <w:pStyle w:val="a5"/>
-        <w:numPr>
-          <w:ilvl w:val="0"/>
-          <w:numId w:val="17"/>
-        </w:numPr>
-        <w:spacing w:before="100" w:beforeAutospacing="1" w:after="100" w:afterAutospacing="1" w:line="240" w:lineRule="auto"/>
-        <w:rPr>
-          <w:rFonts w:ascii="Times New Roman" w:eastAsia="Times New Roman" w:hAnsi="Times New Roman" w:cs="Times New Roman"/>
-          <w:sz w:val="24"/>
-          <w:szCs w:val="24"/>
-          <w:lang w:eastAsia="ru-RU"/>
-        </w:rPr>
-      </w:pPr>
-      <w:r>
-        <w:rPr>
-          <w:rFonts w:ascii="Times New Roman" w:eastAsia="Times New Roman" w:hAnsi="Times New Roman" w:cs="Times New Roman"/>
-          <w:sz w:val="24"/>
-          <w:szCs w:val="24"/>
-          <w:lang w:eastAsia="ru-RU"/>
-        </w:rPr>
-        <w:t>Уточнение бизнес-логики каталога и раздела статей</w:t>
-      </w:r>
-    </w:p>
-    <w:p>
-      <w:pPr>
-        <w:spacing w:before="100" w:beforeAutospacing="1" w:after="100" w:afterAutospacing="1" w:line="240" w:lineRule="auto"/>
-        <w:outlineLvl w:val="2"/>
-        <w:rPr>
-          <w:rFonts w:ascii="Times New Roman" w:eastAsia="Times New Roman" w:hAnsi="Times New Roman" w:cs="Times New Roman"/>
-          <w:b/>
-          <w:bCs/>
-          <w:sz w:val="24"/>
-          <w:szCs w:val="24"/>
-          <w:lang w:eastAsia="ru-RU"/>
-        </w:rPr>
-      </w:pPr>
-      <w:proofErr w:type="spellStart"/>
-      <w:r>
-        <w:rPr>
-          <w:rFonts w:ascii="Times New Roman" w:eastAsia="Times New Roman" w:hAnsi="Times New Roman" w:cs="Times New Roman"/>
-          <w:b/>
-          <w:bCs/>
-          <w:sz w:val="24"/>
-          <w:szCs w:val="24"/>
-          <w:lang w:eastAsia="ru-RU"/>
-        </w:rPr>
-        <w:t>Тестировщик</w:t>
-      </w:r>
-      <w:proofErr w:type="spellEnd"/>
-    </w:p>
-    <w:p>
-      <w:pPr>
-        <w:pStyle w:val="a5"/>
-        <w:numPr>
-          <w:ilvl w:val="0"/>
-          <w:numId w:val="17"/>
-        </w:numPr>
-        <w:spacing w:before="100" w:beforeAutospacing="1" w:after="100" w:afterAutospacing="1" w:line="240" w:lineRule="auto"/>
-        <w:rPr>
-          <w:rFonts w:ascii="Times New Roman" w:eastAsia="Times New Roman" w:hAnsi="Times New Roman" w:cs="Times New Roman"/>
-          <w:sz w:val="24"/>
-          <w:szCs w:val="24"/>
-          <w:lang w:eastAsia="ru-RU"/>
-        </w:rPr>
-      </w:pPr>
-      <w:r>
-        <w:rPr>
-          <w:rFonts w:ascii="Times New Roman" w:eastAsia="Times New Roman" w:hAnsi="Times New Roman" w:cs="Times New Roman"/>
-          <w:sz w:val="24"/>
-          <w:szCs w:val="24"/>
-          <w:lang w:eastAsia="ru-RU"/>
-        </w:rPr>
-        <w:t>Создание тест-кейсов для каталога и статей</w:t>
-      </w:r>
-    </w:p>
-    <w:p>
-      <w:pPr>
-        <w:pStyle w:val="a5"/>
-        <w:numPr>
-          <w:ilvl w:val="0"/>
-          <w:numId w:val="17"/>
-        </w:numPr>
-        <w:spacing w:before="100" w:beforeAutospacing="1" w:after="100" w:afterAutospacing="1" w:line="240" w:lineRule="auto"/>
-        <w:rPr>
-          <w:rFonts w:ascii="Times New Roman" w:eastAsia="Times New Roman" w:hAnsi="Times New Roman" w:cs="Times New Roman"/>
-          <w:sz w:val="24"/>
-          <w:szCs w:val="24"/>
-          <w:lang w:eastAsia="ru-RU"/>
-        </w:rPr>
-      </w:pPr>
-      <w:r>
-        <w:rPr>
-          <w:rFonts w:ascii="Times New Roman" w:eastAsia="Times New Roman" w:hAnsi="Times New Roman" w:cs="Times New Roman"/>
-          <w:sz w:val="24"/>
-          <w:szCs w:val="24"/>
-          <w:lang w:eastAsia="ru-RU"/>
-        </w:rPr>
-        <w:t xml:space="preserve">Тестирование </w:t>
-      </w:r>
-      <w:proofErr w:type="spellStart"/>
-      <w:r>
-        <w:rPr>
-          <w:rFonts w:ascii="Times New Roman" w:eastAsia="Times New Roman" w:hAnsi="Times New Roman" w:cs="Times New Roman"/>
-          <w:sz w:val="24"/>
-          <w:szCs w:val="24"/>
-          <w:lang w:eastAsia="ru-RU"/>
-        </w:rPr>
-        <w:t>backend</w:t>
-      </w:r>
-      <w:proofErr w:type="spellEnd"/>
-      <w:r>
-        <w:rPr>
-          <w:rFonts w:ascii="Times New Roman" w:eastAsia="Times New Roman" w:hAnsi="Times New Roman" w:cs="Times New Roman"/>
-          <w:sz w:val="24"/>
-          <w:szCs w:val="24"/>
-          <w:lang w:eastAsia="ru-RU"/>
-        </w:rPr>
-        <w:t xml:space="preserve"> </w:t>
-      </w:r>
-      <w:proofErr w:type="spellStart"/>
-      <w:r>
-        <w:rPr>
-          <w:rFonts w:ascii="Times New Roman" w:eastAsia="Times New Roman" w:hAnsi="Times New Roman" w:cs="Times New Roman"/>
-          <w:sz w:val="24"/>
-          <w:szCs w:val="24"/>
-          <w:lang w:eastAsia="ru-RU"/>
-        </w:rPr>
-        <w:t>endpoints</w:t>
-      </w:r>
-      <w:proofErr w:type="spellEnd"/>
-      <w:r>
-        <w:rPr>
-          <w:rFonts w:ascii="Times New Roman" w:eastAsia="Times New Roman" w:hAnsi="Times New Roman" w:cs="Times New Roman"/>
-          <w:sz w:val="24"/>
-          <w:szCs w:val="24"/>
-          <w:lang w:eastAsia="ru-RU"/>
-        </w:rPr>
-        <w:t xml:space="preserve"> (товары, статьи)</w:t>
-      </w:r>
-    </w:p>
-    <w:p>
-      <w:pPr>
-        <w:spacing w:before="100" w:beforeAutospacing="1" w:after="100" w:afterAutospacing="1" w:line="240" w:lineRule="auto"/>
-        <w:outlineLvl w:val="2"/>
-        <w:rPr>
-          <w:rFonts w:ascii="Times New Roman" w:eastAsia="Times New Roman" w:hAnsi="Times New Roman" w:cs="Times New Roman"/>
-          <w:b/>
-          <w:bCs/>
-          <w:sz w:val="24"/>
-          <w:szCs w:val="24"/>
-          <w:lang w:eastAsia="ru-RU"/>
-        </w:rPr>
-      </w:pPr>
-      <w:r>
-        <w:rPr>
-          <w:rFonts w:ascii="Times New Roman" w:eastAsia="Times New Roman" w:hAnsi="Times New Roman" w:cs="Times New Roman"/>
-          <w:b/>
-          <w:bCs/>
-          <w:sz w:val="24"/>
-          <w:szCs w:val="24"/>
-          <w:lang w:eastAsia="ru-RU"/>
-        </w:rPr>
-        <w:t>ИИ-разработчик</w:t>
-      </w:r>
-    </w:p>
-    <w:p>
-      <w:pPr>
-        <w:pStyle w:val="a5"/>
-        <w:numPr>
-          <w:ilvl w:val="0"/>
-          <w:numId w:val="17"/>
-        </w:numPr>
-        <w:spacing w:before="100" w:beforeAutospacing="1" w:after="100" w:afterAutospacing="1" w:line="240" w:lineRule="auto"/>
-        <w:rPr>
-          <w:rFonts w:ascii="Times New Roman" w:eastAsia="Times New Roman" w:hAnsi="Times New Roman" w:cs="Times New Roman"/>
-          <w:sz w:val="24"/>
-          <w:szCs w:val="24"/>
-          <w:lang w:eastAsia="ru-RU"/>
-        </w:rPr>
-      </w:pPr>
-      <w:r>
-        <w:rPr>
-          <w:rFonts w:ascii="Times New Roman" w:eastAsia="Times New Roman" w:hAnsi="Times New Roman" w:cs="Times New Roman"/>
-          <w:sz w:val="24"/>
-          <w:szCs w:val="24"/>
-          <w:lang w:eastAsia="ru-RU"/>
-        </w:rPr>
-        <w:t>Подготовка классификации ключевых слов для товаров</w:t>
-      </w:r>
-    </w:p>
-    <w:p>
-      <w:pPr>
-        <w:pStyle w:val="a5"/>
-        <w:numPr>
-          <w:ilvl w:val="0"/>
-          <w:numId w:val="17"/>
-        </w:numPr>
-        <w:spacing w:before="100" w:beforeAutospacing="1" w:after="100" w:afterAutospacing="1" w:line="240" w:lineRule="auto"/>
-        <w:rPr>
-          <w:rFonts w:ascii="Times New Roman" w:eastAsia="Times New Roman" w:hAnsi="Times New Roman" w:cs="Times New Roman"/>
-          <w:sz w:val="24"/>
-          <w:szCs w:val="24"/>
-          <w:lang w:eastAsia="ru-RU"/>
-        </w:rPr>
-      </w:pPr>
-      <w:r>
-        <w:rPr>
-          <w:rFonts w:ascii="Times New Roman" w:eastAsia="Times New Roman" w:hAnsi="Times New Roman" w:cs="Times New Roman"/>
-          <w:sz w:val="24"/>
-          <w:szCs w:val="24"/>
-          <w:lang w:eastAsia="ru-RU"/>
-        </w:rPr>
-        <w:t>Формирование тестового набора данных по статьям</w:t>
-      </w:r>
-    </w:p>
-    <w:p>
-      <w:pPr>
-        <w:spacing w:after="0" w:line="240" w:lineRule="auto"/>
-        <w:rPr>
-          <w:rFonts w:ascii="Times New Roman" w:eastAsia="Times New Roman" w:hAnsi="Times New Roman" w:cs="Times New Roman"/>
-          <w:sz w:val="24"/>
-          <w:szCs w:val="24"/>
-          <w:lang w:eastAsia="ru-RU"/>
-        </w:rPr>
-      </w:pPr>
-      <w:r>
-        <w:rPr>
-          <w:rFonts w:ascii="Times New Roman" w:eastAsia="Times New Roman" w:hAnsi="Times New Roman" w:cs="Times New Roman"/>
-          <w:sz w:val="24"/>
-          <w:szCs w:val="24"/>
-          <w:lang w:eastAsia="ru-RU"/>
-        </w:rPr>
-        <w:pict>
-          <v:rect id="_x0000_i1063" style="width:0;height:1.5pt" o:hralign="center" o:hrstd="t" o:hr="t" fillcolor="#a0a0a0" stroked="f"/>
-        </w:pict>
-      </w:r>
-    </w:p>
-    <w:p>
-      <w:pPr>
-        <w:spacing w:before="100" w:beforeAutospacing="1" w:after="100" w:afterAutospacing="1" w:line="240" w:lineRule="auto"/>
-        <w:outlineLvl w:val="0"/>
-        <w:rPr>
-          <w:rFonts w:ascii="Times New Roman" w:eastAsia="Times New Roman" w:hAnsi="Times New Roman" w:cs="Times New Roman"/>
-          <w:b/>
-          <w:bCs/>
-          <w:kern w:val="36"/>
-          <w:sz w:val="24"/>
-          <w:szCs w:val="24"/>
-          <w:lang w:eastAsia="ru-RU"/>
-        </w:rPr>
-      </w:pPr>
-      <w:r>
-        <w:rPr>
-          <w:rFonts w:ascii="Times New Roman" w:eastAsia="Times New Roman" w:hAnsi="Times New Roman" w:cs="Times New Roman"/>
-          <w:b/>
-          <w:bCs/>
-          <w:kern w:val="36"/>
-          <w:sz w:val="24"/>
-          <w:szCs w:val="24"/>
-          <w:lang w:eastAsia="ru-RU"/>
-        </w:rPr>
-        <w:t>СПРИНТ 3</w:t>
-      </w:r>
-    </w:p>
-    <w:p>
-      <w:pPr>
-        <w:spacing w:before="100" w:beforeAutospacing="1" w:after="100" w:afterAutospacing="1" w:line="240" w:lineRule="auto"/>
-        <w:outlineLvl w:val="2"/>
-        <w:rPr>
-          <w:rFonts w:ascii="Times New Roman" w:eastAsia="Times New Roman" w:hAnsi="Times New Roman" w:cs="Times New Roman"/>
-          <w:b/>
-          <w:bCs/>
-          <w:sz w:val="24"/>
-          <w:szCs w:val="24"/>
-          <w:lang w:eastAsia="ru-RU"/>
-        </w:rPr>
-      </w:pPr>
-      <w:r>
-        <w:rPr>
-          <w:rFonts w:ascii="Times New Roman" w:eastAsia="Times New Roman" w:hAnsi="Times New Roman" w:cs="Times New Roman"/>
-          <w:b/>
-          <w:bCs/>
-          <w:sz w:val="24"/>
-          <w:szCs w:val="24"/>
-          <w:lang w:eastAsia="ru-RU"/>
-        </w:rPr>
-        <w:t>Период: 14.12.2025 — 27.12.2025</w:t>
-      </w:r>
-    </w:p>
-    <w:p>
-      <w:pPr>
-        <w:spacing w:before="100" w:beforeAutospacing="1" w:after="100" w:afterAutospacing="1" w:line="240" w:lineRule="auto"/>
-        <w:outlineLvl w:val="1"/>
-        <w:rPr>
-          <w:rFonts w:ascii="Times New Roman" w:eastAsia="Times New Roman" w:hAnsi="Times New Roman" w:cs="Times New Roman"/>
-          <w:b/>
-          <w:bCs/>
-          <w:sz w:val="24"/>
-          <w:szCs w:val="24"/>
-          <w:lang w:eastAsia="ru-RU"/>
-        </w:rPr>
-      </w:pPr>
-      <w:r>
-        <w:rPr>
-          <w:rFonts w:ascii="Times New Roman" w:eastAsia="Times New Roman" w:hAnsi="Times New Roman" w:cs="Times New Roman"/>
-          <w:b/>
-          <w:bCs/>
-          <w:sz w:val="24"/>
-          <w:szCs w:val="24"/>
-          <w:lang w:eastAsia="ru-RU"/>
-        </w:rPr>
-        <w:t>Задачи спринта:</w:t>
-      </w:r>
-    </w:p>
-    <w:p>
-      <w:pPr>
-        <w:spacing w:before="100" w:beforeAutospacing="1" w:after="100" w:afterAutospacing="1" w:line="240" w:lineRule="auto"/>
-        <w:outlineLvl w:val="2"/>
-        <w:rPr>
-          <w:rFonts w:ascii="Times New Roman" w:eastAsia="Times New Roman" w:hAnsi="Times New Roman" w:cs="Times New Roman"/>
-          <w:b/>
-          <w:bCs/>
-          <w:sz w:val="24"/>
-          <w:szCs w:val="24"/>
-          <w:lang w:eastAsia="ru-RU"/>
-        </w:rPr>
-      </w:pPr>
-      <w:proofErr w:type="spellStart"/>
-      <w:r>
-        <w:rPr>
-          <w:rFonts w:ascii="Times New Roman" w:eastAsia="Times New Roman" w:hAnsi="Times New Roman" w:cs="Times New Roman"/>
-          <w:b/>
-          <w:bCs/>
-          <w:sz w:val="24"/>
-          <w:szCs w:val="24"/>
-          <w:lang w:eastAsia="ru-RU"/>
-        </w:rPr>
-        <w:t>Backend</w:t>
-      </w:r>
-      <w:proofErr w:type="spellEnd"/>
-    </w:p>
-    <w:p>
-      <w:pPr>
-        <w:pStyle w:val="a5"/>
-        <w:numPr>
-          <w:ilvl w:val="0"/>
-          <w:numId w:val="17"/>
-        </w:numPr>
-        <w:spacing w:before="100" w:beforeAutospacing="1" w:after="100" w:afterAutospacing="1" w:line="240" w:lineRule="auto"/>
-        <w:rPr>
-          <w:rFonts w:ascii="Times New Roman" w:eastAsia="Times New Roman" w:hAnsi="Times New Roman" w:cs="Times New Roman"/>
-          <w:sz w:val="24"/>
-          <w:szCs w:val="24"/>
-          <w:lang w:eastAsia="ru-RU"/>
-        </w:rPr>
-      </w:pPr>
-      <w:r>
-        <w:rPr>
-          <w:rFonts w:ascii="Times New Roman" w:eastAsia="Times New Roman" w:hAnsi="Times New Roman" w:cs="Times New Roman"/>
-          <w:sz w:val="24"/>
-          <w:szCs w:val="24"/>
-          <w:lang w:eastAsia="ru-RU"/>
-        </w:rPr>
-        <w:t xml:space="preserve">Создание модели </w:t>
-      </w:r>
-      <w:proofErr w:type="spellStart"/>
-      <w:r>
-        <w:rPr>
-          <w:rFonts w:ascii="Times New Roman" w:eastAsia="Times New Roman" w:hAnsi="Times New Roman" w:cs="Times New Roman"/>
-          <w:sz w:val="24"/>
-          <w:szCs w:val="24"/>
-          <w:lang w:eastAsia="ru-RU"/>
-        </w:rPr>
-        <w:t>Cart</w:t>
-      </w:r>
-      <w:proofErr w:type="spellEnd"/>
-    </w:p>
-    <w:p>
-      <w:pPr>
-        <w:pStyle w:val="a5"/>
-        <w:numPr>
-          <w:ilvl w:val="0"/>
-          <w:numId w:val="17"/>
-        </w:numPr>
-        <w:spacing w:before="100" w:beforeAutospacing="1" w:after="100" w:afterAutospacing="1" w:line="240" w:lineRule="auto"/>
-        <w:rPr>
-          <w:rFonts w:ascii="Times New Roman" w:eastAsia="Times New Roman" w:hAnsi="Times New Roman" w:cs="Times New Roman"/>
-          <w:sz w:val="24"/>
-          <w:szCs w:val="24"/>
-          <w:lang w:eastAsia="ru-RU"/>
-        </w:rPr>
-      </w:pPr>
-      <w:r>
-        <w:rPr>
-          <w:rFonts w:ascii="Times New Roman" w:eastAsia="Times New Roman" w:hAnsi="Times New Roman" w:cs="Times New Roman"/>
-          <w:sz w:val="24"/>
-          <w:szCs w:val="24"/>
-          <w:lang w:eastAsia="ru-RU"/>
-        </w:rPr>
-        <w:t xml:space="preserve">Реализация </w:t>
-      </w:r>
-      <w:proofErr w:type="spellStart"/>
-      <w:r>
-        <w:rPr>
-          <w:rFonts w:ascii="Times New Roman" w:eastAsia="Times New Roman" w:hAnsi="Times New Roman" w:cs="Times New Roman"/>
-          <w:sz w:val="24"/>
-          <w:szCs w:val="24"/>
-          <w:lang w:eastAsia="ru-RU"/>
-        </w:rPr>
-        <w:t>Endpoints</w:t>
-      </w:r>
-      <w:proofErr w:type="spellEnd"/>
-      <w:r>
-        <w:rPr>
-          <w:rFonts w:ascii="Times New Roman" w:eastAsia="Times New Roman" w:hAnsi="Times New Roman" w:cs="Times New Roman"/>
-          <w:sz w:val="24"/>
-          <w:szCs w:val="24"/>
-          <w:lang w:eastAsia="ru-RU"/>
-        </w:rPr>
-        <w:t xml:space="preserve"> для корзины</w:t>
-      </w:r>
-    </w:p>
-    <w:p>
-      <w:pPr>
-        <w:pStyle w:val="a5"/>
-        <w:numPr>
-          <w:ilvl w:val="0"/>
-          <w:numId w:val="17"/>
-        </w:numPr>
-        <w:spacing w:before="100" w:beforeAutospacing="1" w:after="100" w:afterAutospacing="1" w:line="240" w:lineRule="auto"/>
-        <w:rPr>
-          <w:rFonts w:ascii="Times New Roman" w:eastAsia="Times New Roman" w:hAnsi="Times New Roman" w:cs="Times New Roman"/>
-          <w:sz w:val="24"/>
-          <w:szCs w:val="24"/>
-          <w:lang w:eastAsia="ru-RU"/>
-        </w:rPr>
-      </w:pPr>
-      <w:r>
-        <w:rPr>
-          <w:rFonts w:ascii="Times New Roman" w:eastAsia="Times New Roman" w:hAnsi="Times New Roman" w:cs="Times New Roman"/>
-          <w:sz w:val="24"/>
-          <w:szCs w:val="24"/>
-          <w:lang w:eastAsia="ru-RU"/>
-        </w:rPr>
-        <w:t xml:space="preserve">Создание модели </w:t>
-      </w:r>
-      <w:proofErr w:type="spellStart"/>
-      <w:r>
-        <w:rPr>
-          <w:rFonts w:ascii="Times New Roman" w:eastAsia="Times New Roman" w:hAnsi="Times New Roman" w:cs="Times New Roman"/>
-          <w:sz w:val="24"/>
-          <w:szCs w:val="24"/>
-          <w:lang w:eastAsia="ru-RU"/>
-        </w:rPr>
-        <w:t>Order</w:t>
-      </w:r>
-      <w:proofErr w:type="spellEnd"/>
-    </w:p>
-    <w:p>
-      <w:pPr>
-        <w:spacing w:before="100" w:beforeAutospacing="1" w:after="100" w:afterAutospacing="1" w:line="240" w:lineRule="auto"/>
-        <w:outlineLvl w:val="2"/>
-        <w:rPr>
-          <w:rFonts w:ascii="Times New Roman" w:eastAsia="Times New Roman" w:hAnsi="Times New Roman" w:cs="Times New Roman"/>
-          <w:b/>
-          <w:bCs/>
-          <w:sz w:val="24"/>
-          <w:szCs w:val="24"/>
-          <w:lang w:eastAsia="ru-RU"/>
-        </w:rPr>
-      </w:pPr>
-      <w:proofErr w:type="spellStart"/>
-      <w:r>
-        <w:rPr>
-          <w:rFonts w:ascii="Times New Roman" w:eastAsia="Times New Roman" w:hAnsi="Times New Roman" w:cs="Times New Roman"/>
-          <w:b/>
-          <w:bCs/>
-          <w:sz w:val="24"/>
-          <w:szCs w:val="24"/>
-          <w:lang w:eastAsia="ru-RU"/>
-        </w:rPr>
-        <w:t>Frontend</w:t>
-      </w:r>
-      <w:proofErr w:type="spellEnd"/>
-    </w:p>
-    <w:p>
-      <w:pPr>
-        <w:pStyle w:val="a5"/>
-        <w:numPr>
-          <w:ilvl w:val="0"/>
-          <w:numId w:val="17"/>
-        </w:numPr>
-        <w:spacing w:before="100" w:beforeAutospacing="1" w:after="100" w:afterAutospacing="1" w:line="240" w:lineRule="auto"/>
-        <w:rPr>
-          <w:rFonts w:ascii="Times New Roman" w:eastAsia="Times New Roman" w:hAnsi="Times New Roman" w:cs="Times New Roman"/>
-          <w:sz w:val="24"/>
-          <w:szCs w:val="24"/>
-          <w:lang w:eastAsia="ru-RU"/>
-        </w:rPr>
-      </w:pPr>
-      <w:r>
-        <w:rPr>
-          <w:rFonts w:ascii="Times New Roman" w:eastAsia="Times New Roman" w:hAnsi="Times New Roman" w:cs="Times New Roman"/>
-          <w:sz w:val="24"/>
-          <w:szCs w:val="24"/>
-          <w:lang w:eastAsia="ru-RU"/>
-        </w:rPr>
-        <w:t>Разработка страницы корзины</w:t>
-      </w:r>
-    </w:p>
-    <w:p>
-      <w:pPr>
-        <w:pStyle w:val="a5"/>
-        <w:numPr>
-          <w:ilvl w:val="0"/>
-          <w:numId w:val="17"/>
-        </w:numPr>
-        <w:spacing w:before="100" w:beforeAutospacing="1" w:after="100" w:afterAutospacing="1" w:line="240" w:lineRule="auto"/>
-        <w:rPr>
-          <w:rFonts w:ascii="Times New Roman" w:eastAsia="Times New Roman" w:hAnsi="Times New Roman" w:cs="Times New Roman"/>
-          <w:sz w:val="24"/>
-          <w:szCs w:val="24"/>
-          <w:lang w:eastAsia="ru-RU"/>
-        </w:rPr>
-      </w:pPr>
-      <w:r>
-        <w:rPr>
-          <w:rFonts w:ascii="Times New Roman" w:eastAsia="Times New Roman" w:hAnsi="Times New Roman" w:cs="Times New Roman"/>
-          <w:sz w:val="24"/>
-          <w:szCs w:val="24"/>
-          <w:lang w:eastAsia="ru-RU"/>
-        </w:rPr>
-        <w:t>Разработка главной страницы</w:t>
-      </w:r>
-    </w:p>
-    <w:p>
-      <w:pPr>
-        <w:spacing w:before="100" w:beforeAutospacing="1" w:after="100" w:afterAutospacing="1" w:line="240" w:lineRule="auto"/>
-        <w:outlineLvl w:val="2"/>
-        <w:rPr>
-          <w:rFonts w:ascii="Times New Roman" w:eastAsia="Times New Roman" w:hAnsi="Times New Roman" w:cs="Times New Roman"/>
-          <w:b/>
-          <w:bCs/>
-          <w:sz w:val="24"/>
-          <w:szCs w:val="24"/>
-          <w:lang w:eastAsia="ru-RU"/>
-        </w:rPr>
-      </w:pPr>
-      <w:r>
-        <w:rPr>
-          <w:rFonts w:ascii="Times New Roman" w:eastAsia="Times New Roman" w:hAnsi="Times New Roman" w:cs="Times New Roman"/>
-          <w:b/>
-          <w:bCs/>
-          <w:sz w:val="24"/>
-          <w:szCs w:val="24"/>
-          <w:lang w:eastAsia="ru-RU"/>
-        </w:rPr>
-        <w:t>Аналитик</w:t>
-      </w:r>
-    </w:p>
-    <w:p>
-      <w:pPr>
-        <w:pStyle w:val="a5"/>
-        <w:numPr>
-          <w:ilvl w:val="0"/>
-          <w:numId w:val="17"/>
-        </w:numPr>
-        <w:spacing w:before="100" w:beforeAutospacing="1" w:after="100" w:afterAutospacing="1" w:line="240" w:lineRule="auto"/>
-        <w:rPr>
-          <w:rFonts w:ascii="Times New Roman" w:eastAsia="Times New Roman" w:hAnsi="Times New Roman" w:cs="Times New Roman"/>
-          <w:sz w:val="24"/>
-          <w:szCs w:val="24"/>
-          <w:lang w:eastAsia="ru-RU"/>
-        </w:rPr>
-      </w:pPr>
-      <w:r>
-        <w:rPr>
-          <w:rFonts w:ascii="Times New Roman" w:eastAsia="Times New Roman" w:hAnsi="Times New Roman" w:cs="Times New Roman"/>
-          <w:sz w:val="24"/>
-          <w:szCs w:val="24"/>
-          <w:lang w:eastAsia="ru-RU"/>
-        </w:rPr>
-        <w:t>Описание бизнес-логики корзины и оформления заказа</w:t>
-      </w:r>
-    </w:p>
-    <w:p>
-      <w:pPr>
-        <w:pStyle w:val="a5"/>
-        <w:numPr>
-          <w:ilvl w:val="0"/>
-          <w:numId w:val="17"/>
-        </w:numPr>
-        <w:spacing w:before="100" w:beforeAutospacing="1" w:after="100" w:afterAutospacing="1" w:line="240" w:lineRule="auto"/>
-        <w:rPr>
-          <w:rFonts w:ascii="Times New Roman" w:eastAsia="Times New Roman" w:hAnsi="Times New Roman" w:cs="Times New Roman"/>
-          <w:sz w:val="24"/>
-          <w:szCs w:val="24"/>
-          <w:lang w:eastAsia="ru-RU"/>
-        </w:rPr>
-      </w:pPr>
-      <w:r>
-        <w:rPr>
-          <w:rFonts w:ascii="Times New Roman" w:eastAsia="Times New Roman" w:hAnsi="Times New Roman" w:cs="Times New Roman"/>
-          <w:sz w:val="24"/>
-          <w:szCs w:val="24"/>
-          <w:lang w:eastAsia="ru-RU"/>
-        </w:rPr>
-        <w:t>Подготовка API-контракта для корзины и заказа</w:t>
-      </w:r>
-    </w:p>
-    <w:p>
-      <w:pPr>
-        <w:spacing w:before="100" w:beforeAutospacing="1" w:after="100" w:afterAutospacing="1" w:line="240" w:lineRule="auto"/>
-        <w:outlineLvl w:val="2"/>
-        <w:rPr>
-          <w:rFonts w:ascii="Times New Roman" w:eastAsia="Times New Roman" w:hAnsi="Times New Roman" w:cs="Times New Roman"/>
-          <w:b/>
-          <w:bCs/>
-          <w:sz w:val="24"/>
-          <w:szCs w:val="24"/>
-          <w:lang w:eastAsia="ru-RU"/>
-        </w:rPr>
-      </w:pPr>
-      <w:proofErr w:type="spellStart"/>
-      <w:r>
-        <w:rPr>
-          <w:rFonts w:ascii="Times New Roman" w:eastAsia="Times New Roman" w:hAnsi="Times New Roman" w:cs="Times New Roman"/>
-          <w:b/>
-          <w:bCs/>
-          <w:sz w:val="24"/>
-          <w:szCs w:val="24"/>
-          <w:lang w:eastAsia="ru-RU"/>
-        </w:rPr>
-        <w:t>Тестировщик</w:t>
-      </w:r>
-      <w:proofErr w:type="spellEnd"/>
-    </w:p>
-    <w:p>
-      <w:pPr>
-        <w:pStyle w:val="a5"/>
-        <w:numPr>
-          <w:ilvl w:val="0"/>
-          <w:numId w:val="17"/>
-        </w:numPr>
-        <w:spacing w:before="100" w:beforeAutospacing="1" w:after="100" w:afterAutospacing="1" w:line="240" w:lineRule="auto"/>
-        <w:rPr>
-          <w:rFonts w:ascii="Times New Roman" w:eastAsia="Times New Roman" w:hAnsi="Times New Roman" w:cs="Times New Roman"/>
-          <w:sz w:val="24"/>
-          <w:szCs w:val="24"/>
-          <w:lang w:eastAsia="ru-RU"/>
-        </w:rPr>
-      </w:pPr>
-      <w:r>
-        <w:rPr>
-          <w:rFonts w:ascii="Times New Roman" w:eastAsia="Times New Roman" w:hAnsi="Times New Roman" w:cs="Times New Roman"/>
-          <w:sz w:val="24"/>
-          <w:szCs w:val="24"/>
-          <w:lang w:eastAsia="ru-RU"/>
-        </w:rPr>
-        <w:t>Создание тест-кейсов для корзины</w:t>
-      </w:r>
-    </w:p>
-    <w:p>
-      <w:pPr>
-        <w:pStyle w:val="a5"/>
-        <w:numPr>
-          <w:ilvl w:val="0"/>
-          <w:numId w:val="17"/>
-        </w:numPr>
-        <w:spacing w:before="100" w:beforeAutospacing="1" w:after="100" w:afterAutospacing="1" w:line="240" w:lineRule="auto"/>
-        <w:rPr>
-          <w:rFonts w:ascii="Times New Roman" w:eastAsia="Times New Roman" w:hAnsi="Times New Roman" w:cs="Times New Roman"/>
-          <w:sz w:val="24"/>
-          <w:szCs w:val="24"/>
-          <w:lang w:eastAsia="ru-RU"/>
-        </w:rPr>
-      </w:pPr>
-      <w:proofErr w:type="spellStart"/>
-      <w:r>
-        <w:rPr>
-          <w:rFonts w:ascii="Times New Roman" w:eastAsia="Times New Roman" w:hAnsi="Times New Roman" w:cs="Times New Roman"/>
-          <w:sz w:val="24"/>
-          <w:szCs w:val="24"/>
-          <w:lang w:eastAsia="ru-RU"/>
-        </w:rPr>
-        <w:t>Smoke</w:t>
-      </w:r>
-      <w:proofErr w:type="spellEnd"/>
-      <w:r>
-        <w:rPr>
-          <w:rFonts w:ascii="Times New Roman" w:eastAsia="Times New Roman" w:hAnsi="Times New Roman" w:cs="Times New Roman"/>
-          <w:sz w:val="24"/>
-          <w:szCs w:val="24"/>
-          <w:lang w:eastAsia="ru-RU"/>
-        </w:rPr>
-        <w:t>-тест главной страницы</w:t>
-      </w:r>
-    </w:p>
-    <w:p>
-      <w:pPr>
-        <w:spacing w:before="100" w:beforeAutospacing="1" w:after="100" w:afterAutospacing="1" w:line="240" w:lineRule="auto"/>
-        <w:outlineLvl w:val="2"/>
-        <w:rPr>
-          <w:rFonts w:ascii="Times New Roman" w:eastAsia="Times New Roman" w:hAnsi="Times New Roman" w:cs="Times New Roman"/>
-          <w:b/>
-          <w:bCs/>
-          <w:sz w:val="24"/>
-          <w:szCs w:val="24"/>
-          <w:lang w:eastAsia="ru-RU"/>
-        </w:rPr>
-      </w:pPr>
-      <w:r>
-        <w:rPr>
-          <w:rFonts w:ascii="Times New Roman" w:eastAsia="Times New Roman" w:hAnsi="Times New Roman" w:cs="Times New Roman"/>
-          <w:b/>
-          <w:bCs/>
-          <w:sz w:val="24"/>
-          <w:szCs w:val="24"/>
-          <w:lang w:eastAsia="ru-RU"/>
-        </w:rPr>
-        <w:t>ИИ-разработчик</w:t>
-      </w:r>
-    </w:p>
-    <w:p>
-      <w:pPr>
-        <w:pStyle w:val="a5"/>
-        <w:numPr>
-          <w:ilvl w:val="0"/>
-          <w:numId w:val="17"/>
-        </w:numPr>
-        <w:spacing w:before="100" w:beforeAutospacing="1" w:after="100" w:afterAutospacing="1" w:line="240" w:lineRule="auto"/>
-        <w:rPr>
-          <w:rFonts w:ascii="Times New Roman" w:eastAsia="Times New Roman" w:hAnsi="Times New Roman" w:cs="Times New Roman"/>
-          <w:sz w:val="24"/>
-          <w:szCs w:val="24"/>
-          <w:lang w:eastAsia="ru-RU"/>
-        </w:rPr>
-      </w:pPr>
-      <w:r>
-        <w:rPr>
-          <w:rFonts w:ascii="Times New Roman" w:eastAsia="Times New Roman" w:hAnsi="Times New Roman" w:cs="Times New Roman"/>
-          <w:sz w:val="24"/>
-          <w:szCs w:val="24"/>
-          <w:lang w:eastAsia="ru-RU"/>
-        </w:rPr>
-        <w:t>Создание черновой модели ранжирования товаров и статей</w:t>
-      </w:r>
-    </w:p>
-    <w:p>
-      <w:pPr>
-        <w:pStyle w:val="a5"/>
-        <w:numPr>
-          <w:ilvl w:val="0"/>
-          <w:numId w:val="17"/>
-        </w:numPr>
-        <w:spacing w:before="100" w:beforeAutospacing="1" w:after="100" w:afterAutospacing="1" w:line="240" w:lineRule="auto"/>
-        <w:rPr>
-          <w:rFonts w:ascii="Times New Roman" w:eastAsia="Times New Roman" w:hAnsi="Times New Roman" w:cs="Times New Roman"/>
-          <w:sz w:val="24"/>
-          <w:szCs w:val="24"/>
-          <w:lang w:eastAsia="ru-RU"/>
-        </w:rPr>
-      </w:pPr>
-      <w:r>
-        <w:rPr>
-          <w:rFonts w:ascii="Times New Roman" w:eastAsia="Times New Roman" w:hAnsi="Times New Roman" w:cs="Times New Roman"/>
-          <w:sz w:val="24"/>
-          <w:szCs w:val="24"/>
-          <w:lang w:eastAsia="ru-RU"/>
-        </w:rPr>
-        <w:t>Подготовка API-макета обработки поискового запроса</w:t>
-      </w:r>
-    </w:p>
-    <w:p>
-      <w:pPr>
-        <w:spacing w:line="240" w:lineRule="auto"/>
-        <w:rPr>
-          <w:rFonts w:ascii="Times New Roman" w:hAnsi="Times New Roman" w:cs="Times New Roman"/>
-          <w:sz w:val="24"/>
-          <w:szCs w:val="24"/>
-        </w:rPr>
-      </w:pPr>
-    </w:p>
+    <w:p/>
     <w:sectPr>
       <w:pgSz w:w="11906" w:h="16838"/>
       <w:pgMar w:top="1134" w:right="850" w:bottom="1134" w:left="1701" w:header="708" w:footer="708" w:gutter="0"/>
@@ -1874,7 +1170,7 @@
 </file>
 
 <file path=word/numbering.xml><?xml version="1.0" encoding="utf-8"?>
-<w:numbering xmlns:wpc="http://schemas.microsoft.com/office/word/2010/wordprocessingCanvas" xmlns:cx="http://schemas.microsoft.com/office/drawing/2014/chartex" xmlns:cx1="http://schemas.microsoft.com/office/drawing/2015/9/8/chartex" xmlns:mc="http://schemas.openxmlformats.org/markup-compatibility/2006" xmlns:o="urn:schemas-microsoft-com:office:office" xmlns:r="http://schemas.openxmlformats.org/officeDocument/2006/relationships" xmlns:m="http://schemas.openxmlformats.org/officeDocument/2006/math" xmlns:v="urn:schemas-microsoft-com:vml" xmlns:wp14="http://schemas.microsoft.com/office/word/2010/wordprocessingDrawing" xmlns:wp="http://schemas.openxmlformats.org/drawingml/2006/wordprocessingDrawing" xmlns:w10="urn:schemas-microsoft-com:office:word" xmlns:w="http://schemas.openxmlformats.org/wordprocessingml/2006/main" xmlns:w14="http://schemas.microsoft.com/office/word/2010/wordml" xmlns:w15="http://schemas.microsoft.com/office/word/2012/wordml" xmlns:w16se="http://schemas.microsoft.com/office/word/2015/wordml/symex" xmlns:wpg="http://schemas.microsoft.com/office/word/2010/wordprocessingGroup" xmlns:wpi="http://schemas.microsoft.com/office/word/2010/wordprocessingInk" xmlns:wne="http://schemas.microsoft.com/office/word/2006/wordml" xmlns:wps="http://schemas.microsoft.com/office/word/2010/wordprocessingShape" mc:Ignorable="w14 w15 w16se wp14">
+<w:numbering xmlns:wpc="http://schemas.microsoft.com/office/word/2010/wordprocessingCanvas" xmlns:cx="http://schemas.microsoft.com/office/drawing/2014/chartex" xmlns:cx1="http://schemas.microsoft.com/office/drawing/2015/9/8/chartex" xmlns:cx2="http://schemas.microsoft.com/office/drawing/2015/10/21/chartex" xmlns:cx3="http://schemas.microsoft.com/office/drawing/2016/5/9/chartex" xmlns:cx4="http://schemas.microsoft.com/office/drawing/2016/5/10/chartex" xmlns:cx5="http://schemas.microsoft.com/office/drawing/2016/5/11/chartex" xmlns:cx6="http://schemas.microsoft.com/office/drawing/2016/5/12/chartex" xmlns:cx7="http://schemas.microsoft.com/office/drawing/2016/5/13/chartex" xmlns:cx8="http://schemas.microsoft.com/office/drawing/2016/5/14/chartex" xmlns:mc="http://schemas.openxmlformats.org/markup-compatibility/2006" xmlns:aink="http://schemas.microsoft.com/office/drawing/2016/ink" xmlns:am3d="http://schemas.microsoft.com/office/drawing/2017/model3d" xmlns:o="urn:schemas-microsoft-com:office:office" xmlns:oel="http://schemas.microsoft.com/office/2019/extlst" xmlns:r="http://schemas.openxmlformats.org/officeDocument/2006/relationships" xmlns:m="http://schemas.openxmlformats.org/officeDocument/2006/math" xmlns:v="urn:schemas-microsoft-com:vml" xmlns:wp14="http://schemas.microsoft.com/office/word/2010/wordprocessingDrawing" xmlns:wp="http://schemas.openxmlformats.org/drawingml/2006/wordprocessingDrawing" xmlns:w10="urn:schemas-microsoft-com:office:word" xmlns:w="http://schemas.openxmlformats.org/wordprocessingml/2006/main" xmlns:w14="http://schemas.microsoft.com/office/word/2010/wordml" xmlns:w15="http://schemas.microsoft.com/office/word/2012/wordml" xmlns:w16cex="http://schemas.microsoft.com/office/word/2018/wordml/cex" xmlns:w16cid="http://schemas.microsoft.com/office/word/2016/wordml/cid" xmlns:w16="http://schemas.microsoft.com/office/word/2018/wordml" xmlns:w16du="http://schemas.microsoft.com/office/word/2023/wordml/word16du" xmlns:w16sdtdh="http://schemas.microsoft.com/office/word/2020/wordml/sdtdatahash" xmlns:w16sdtfl="http://schemas.microsoft.com/office/word/2024/wordml/sdtformatlock" xmlns:w16se="http://schemas.microsoft.com/office/word/2015/wordml/symex" xmlns:wpg="http://schemas.microsoft.com/office/word/2010/wordprocessingGroup" xmlns:wpi="http://schemas.microsoft.com/office/word/2010/wordprocessingInk" xmlns:wne="http://schemas.microsoft.com/office/word/2006/wordml" xmlns:wps="http://schemas.microsoft.com/office/word/2010/wordprocessingShape" mc:Ignorable="w14 w15 w16se w16cid w16 w16cex w16sdtdh w16sdtfl w16du wp14">
   <w:abstractNum w:abstractNumId="0" w15:restartNumberingAfterBreak="0">
     <w:nsid w:val="01EE484C"/>
     <w:multiLevelType w:val="multilevel"/>
@@ -2621,6 +1917,119 @@
     </w:lvl>
   </w:abstractNum>
   <w:abstractNum w:abstractNumId="5" w15:restartNumberingAfterBreak="0">
+    <w:nsid w:val="13265CE1"/>
+    <w:multiLevelType w:val="hybridMultilevel"/>
+    <w:tmpl w:val="D8BE6CE0"/>
+    <w:lvl w:ilvl="0" w:tplc="04190003">
+      <w:start w:val="1"/>
+      <w:numFmt w:val="bullet"/>
+      <w:lvlText w:val="o"/>
+      <w:lvlJc w:val="left"/>
+      <w:pPr>
+        <w:ind w:left="2160" w:hanging="360"/>
+      </w:pPr>
+      <w:rPr>
+        <w:rFonts w:ascii="Courier New" w:hAnsi="Courier New" w:cs="Courier New" w:hint="default"/>
+      </w:rPr>
+    </w:lvl>
+    <w:lvl w:ilvl="1" w:tplc="04190003" w:tentative="1">
+      <w:start w:val="1"/>
+      <w:numFmt w:val="bullet"/>
+      <w:lvlText w:val="o"/>
+      <w:lvlJc w:val="left"/>
+      <w:pPr>
+        <w:ind w:left="2880" w:hanging="360"/>
+      </w:pPr>
+      <w:rPr>
+        <w:rFonts w:ascii="Courier New" w:hAnsi="Courier New" w:cs="Courier New" w:hint="default"/>
+      </w:rPr>
+    </w:lvl>
+    <w:lvl w:ilvl="2" w:tplc="04190005" w:tentative="1">
+      <w:start w:val="1"/>
+      <w:numFmt w:val="bullet"/>
+      <w:lvlText w:val=""/>
+      <w:lvlJc w:val="left"/>
+      <w:pPr>
+        <w:ind w:left="3600" w:hanging="360"/>
+      </w:pPr>
+      <w:rPr>
+        <w:rFonts w:ascii="Wingdings" w:hAnsi="Wingdings" w:hint="default"/>
+      </w:rPr>
+    </w:lvl>
+    <w:lvl w:ilvl="3" w:tplc="04190001" w:tentative="1">
+      <w:start w:val="1"/>
+      <w:numFmt w:val="bullet"/>
+      <w:lvlText w:val=""/>
+      <w:lvlJc w:val="left"/>
+      <w:pPr>
+        <w:ind w:left="4320" w:hanging="360"/>
+      </w:pPr>
+      <w:rPr>
+        <w:rFonts w:ascii="Symbol" w:hAnsi="Symbol" w:hint="default"/>
+      </w:rPr>
+    </w:lvl>
+    <w:lvl w:ilvl="4" w:tplc="04190003" w:tentative="1">
+      <w:start w:val="1"/>
+      <w:numFmt w:val="bullet"/>
+      <w:lvlText w:val="o"/>
+      <w:lvlJc w:val="left"/>
+      <w:pPr>
+        <w:ind w:left="5040" w:hanging="360"/>
+      </w:pPr>
+      <w:rPr>
+        <w:rFonts w:ascii="Courier New" w:hAnsi="Courier New" w:cs="Courier New" w:hint="default"/>
+      </w:rPr>
+    </w:lvl>
+    <w:lvl w:ilvl="5" w:tplc="04190005" w:tentative="1">
+      <w:start w:val="1"/>
+      <w:numFmt w:val="bullet"/>
+      <w:lvlText w:val=""/>
+      <w:lvlJc w:val="left"/>
+      <w:pPr>
+        <w:ind w:left="5760" w:hanging="360"/>
+      </w:pPr>
+      <w:rPr>
+        <w:rFonts w:ascii="Wingdings" w:hAnsi="Wingdings" w:hint="default"/>
+      </w:rPr>
+    </w:lvl>
+    <w:lvl w:ilvl="6" w:tplc="04190001" w:tentative="1">
+      <w:start w:val="1"/>
+      <w:numFmt w:val="bullet"/>
+      <w:lvlText w:val=""/>
+      <w:lvlJc w:val="left"/>
+      <w:pPr>
+        <w:ind w:left="6480" w:hanging="360"/>
+      </w:pPr>
+      <w:rPr>
+        <w:rFonts w:ascii="Symbol" w:hAnsi="Symbol" w:hint="default"/>
+      </w:rPr>
+    </w:lvl>
+    <w:lvl w:ilvl="7" w:tplc="04190003" w:tentative="1">
+      <w:start w:val="1"/>
+      <w:numFmt w:val="bullet"/>
+      <w:lvlText w:val="o"/>
+      <w:lvlJc w:val="left"/>
+      <w:pPr>
+        <w:ind w:left="7200" w:hanging="360"/>
+      </w:pPr>
+      <w:rPr>
+        <w:rFonts w:ascii="Courier New" w:hAnsi="Courier New" w:cs="Courier New" w:hint="default"/>
+      </w:rPr>
+    </w:lvl>
+    <w:lvl w:ilvl="8" w:tplc="04190005" w:tentative="1">
+      <w:start w:val="1"/>
+      <w:numFmt w:val="bullet"/>
+      <w:lvlText w:val=""/>
+      <w:lvlJc w:val="left"/>
+      <w:pPr>
+        <w:ind w:left="7920" w:hanging="360"/>
+      </w:pPr>
+      <w:rPr>
+        <w:rFonts w:ascii="Wingdings" w:hAnsi="Wingdings" w:hint="default"/>
+      </w:rPr>
+    </w:lvl>
+  </w:abstractNum>
+  <w:abstractNum w:abstractNumId="6" w15:restartNumberingAfterBreak="0">
     <w:nsid w:val="1682300A"/>
     <w:multiLevelType w:val="multilevel"/>
     <w:tmpl w:val="6EB8EB5E"/>
@@ -2769,7 +2178,7 @@
       </w:rPr>
     </w:lvl>
   </w:abstractNum>
-  <w:abstractNum w:abstractNumId="6" w15:restartNumberingAfterBreak="0">
+  <w:abstractNum w:abstractNumId="7" w15:restartNumberingAfterBreak="0">
     <w:nsid w:val="1F3728D2"/>
     <w:multiLevelType w:val="hybridMultilevel"/>
     <w:tmpl w:val="5E845874"/>
@@ -2882,7 +2291,7 @@
       </w:rPr>
     </w:lvl>
   </w:abstractNum>
-  <w:abstractNum w:abstractNumId="7" w15:restartNumberingAfterBreak="0">
+  <w:abstractNum w:abstractNumId="8" w15:restartNumberingAfterBreak="0">
     <w:nsid w:val="206A38D9"/>
     <w:multiLevelType w:val="multilevel"/>
     <w:tmpl w:val="21A2885A"/>
@@ -3031,7 +2440,7 @@
       </w:rPr>
     </w:lvl>
   </w:abstractNum>
-  <w:abstractNum w:abstractNumId="8" w15:restartNumberingAfterBreak="0">
+  <w:abstractNum w:abstractNumId="9" w15:restartNumberingAfterBreak="0">
     <w:nsid w:val="3DE2390A"/>
     <w:multiLevelType w:val="multilevel"/>
     <w:tmpl w:val="D0B40444"/>
@@ -3180,7 +2589,7 @@
       </w:rPr>
     </w:lvl>
   </w:abstractNum>
-  <w:abstractNum w:abstractNumId="9" w15:restartNumberingAfterBreak="0">
+  <w:abstractNum w:abstractNumId="10" w15:restartNumberingAfterBreak="0">
     <w:nsid w:val="428D6E5A"/>
     <w:multiLevelType w:val="multilevel"/>
     <w:tmpl w:val="82CAFA8C"/>
@@ -3329,7 +2738,7 @@
       </w:rPr>
     </w:lvl>
   </w:abstractNum>
-  <w:abstractNum w:abstractNumId="10" w15:restartNumberingAfterBreak="0">
+  <w:abstractNum w:abstractNumId="11" w15:restartNumberingAfterBreak="0">
     <w:nsid w:val="440C4550"/>
     <w:multiLevelType w:val="multilevel"/>
     <w:tmpl w:val="99500C34"/>
@@ -3478,7 +2887,7 @@
       </w:rPr>
     </w:lvl>
   </w:abstractNum>
-  <w:abstractNum w:abstractNumId="11" w15:restartNumberingAfterBreak="0">
+  <w:abstractNum w:abstractNumId="12" w15:restartNumberingAfterBreak="0">
     <w:nsid w:val="46F90B52"/>
     <w:multiLevelType w:val="multilevel"/>
     <w:tmpl w:val="07F24A0C"/>
@@ -3627,7 +3036,7 @@
       </w:rPr>
     </w:lvl>
   </w:abstractNum>
-  <w:abstractNum w:abstractNumId="12" w15:restartNumberingAfterBreak="0">
+  <w:abstractNum w:abstractNumId="13" w15:restartNumberingAfterBreak="0">
     <w:nsid w:val="47E26917"/>
     <w:multiLevelType w:val="multilevel"/>
     <w:tmpl w:val="A900F68E"/>
@@ -3776,7 +3185,7 @@
       </w:rPr>
     </w:lvl>
   </w:abstractNum>
-  <w:abstractNum w:abstractNumId="13" w15:restartNumberingAfterBreak="0">
+  <w:abstractNum w:abstractNumId="14" w15:restartNumberingAfterBreak="0">
     <w:nsid w:val="54E23947"/>
     <w:multiLevelType w:val="multilevel"/>
     <w:tmpl w:val="38600FE2"/>
@@ -3925,7 +3334,7 @@
       </w:rPr>
     </w:lvl>
   </w:abstractNum>
-  <w:abstractNum w:abstractNumId="14" w15:restartNumberingAfterBreak="0">
+  <w:abstractNum w:abstractNumId="15" w15:restartNumberingAfterBreak="0">
     <w:nsid w:val="58976921"/>
     <w:multiLevelType w:val="hybridMultilevel"/>
     <w:tmpl w:val="F88A8AC4"/>
@@ -3941,7 +3350,7 @@
         <w:rFonts w:ascii="Symbol" w:hAnsi="Symbol" w:hint="default"/>
       </w:rPr>
     </w:lvl>
-    <w:lvl w:ilvl="1" w:tplc="04190003" w:tentative="1">
+    <w:lvl w:ilvl="1" w:tplc="04190003">
       <w:start w:val="1"/>
       <w:numFmt w:val="bullet"/>
       <w:lvlText w:val="o"/>
@@ -4038,7 +3447,7 @@
       </w:rPr>
     </w:lvl>
   </w:abstractNum>
-  <w:abstractNum w:abstractNumId="15" w15:restartNumberingAfterBreak="0">
+  <w:abstractNum w:abstractNumId="16" w15:restartNumberingAfterBreak="0">
     <w:nsid w:val="7E142916"/>
     <w:multiLevelType w:val="multilevel"/>
     <w:tmpl w:val="E2E04A1C"/>
@@ -4187,7 +3596,7 @@
       </w:rPr>
     </w:lvl>
   </w:abstractNum>
-  <w:abstractNum w:abstractNumId="16" w15:restartNumberingAfterBreak="0">
+  <w:abstractNum w:abstractNumId="17" w15:restartNumberingAfterBreak="0">
     <w:nsid w:val="7E711576"/>
     <w:multiLevelType w:val="multilevel"/>
     <w:tmpl w:val="F862759E"/>
@@ -4336,62 +3745,65 @@
       </w:rPr>
     </w:lvl>
   </w:abstractNum>
-  <w:num w:numId="1">
+  <w:num w:numId="1" w16cid:durableId="43409508">
+    <w:abstractNumId w:val="16"/>
+  </w:num>
+  <w:num w:numId="2" w16cid:durableId="1336570563">
+    <w:abstractNumId w:val="11"/>
+  </w:num>
+  <w:num w:numId="3" w16cid:durableId="1004357217">
+    <w:abstractNumId w:val="14"/>
+  </w:num>
+  <w:num w:numId="4" w16cid:durableId="1989163713">
+    <w:abstractNumId w:val="12"/>
+  </w:num>
+  <w:num w:numId="5" w16cid:durableId="1822849913">
+    <w:abstractNumId w:val="4"/>
+  </w:num>
+  <w:num w:numId="6" w16cid:durableId="531304703">
+    <w:abstractNumId w:val="6"/>
+  </w:num>
+  <w:num w:numId="7" w16cid:durableId="316345416">
+    <w:abstractNumId w:val="0"/>
+  </w:num>
+  <w:num w:numId="8" w16cid:durableId="2060782065">
+    <w:abstractNumId w:val="2"/>
+  </w:num>
+  <w:num w:numId="9" w16cid:durableId="21589336">
+    <w:abstractNumId w:val="1"/>
+  </w:num>
+  <w:num w:numId="10" w16cid:durableId="1577083937">
+    <w:abstractNumId w:val="3"/>
+  </w:num>
+  <w:num w:numId="11" w16cid:durableId="1205409083">
+    <w:abstractNumId w:val="17"/>
+  </w:num>
+  <w:num w:numId="12" w16cid:durableId="176121373">
+    <w:abstractNumId w:val="13"/>
+  </w:num>
+  <w:num w:numId="13" w16cid:durableId="85662389">
+    <w:abstractNumId w:val="8"/>
+  </w:num>
+  <w:num w:numId="14" w16cid:durableId="1313024578">
+    <w:abstractNumId w:val="10"/>
+  </w:num>
+  <w:num w:numId="15" w16cid:durableId="743451774">
+    <w:abstractNumId w:val="9"/>
+  </w:num>
+  <w:num w:numId="16" w16cid:durableId="124927961">
+    <w:abstractNumId w:val="7"/>
+  </w:num>
+  <w:num w:numId="17" w16cid:durableId="708647295">
     <w:abstractNumId w:val="15"/>
   </w:num>
-  <w:num w:numId="2">
-    <w:abstractNumId w:val="10"/>
-  </w:num>
-  <w:num w:numId="3">
-    <w:abstractNumId w:val="13"/>
-  </w:num>
-  <w:num w:numId="4">
-    <w:abstractNumId w:val="11"/>
-  </w:num>
-  <w:num w:numId="5">
-    <w:abstractNumId w:val="4"/>
-  </w:num>
-  <w:num w:numId="6">
+  <w:num w:numId="18" w16cid:durableId="388113036">
     <w:abstractNumId w:val="5"/>
-  </w:num>
-  <w:num w:numId="7">
-    <w:abstractNumId w:val="0"/>
-  </w:num>
-  <w:num w:numId="8">
-    <w:abstractNumId w:val="2"/>
-  </w:num>
-  <w:num w:numId="9">
-    <w:abstractNumId w:val="1"/>
-  </w:num>
-  <w:num w:numId="10">
-    <w:abstractNumId w:val="3"/>
-  </w:num>
-  <w:num w:numId="11">
-    <w:abstractNumId w:val="16"/>
-  </w:num>
-  <w:num w:numId="12">
-    <w:abstractNumId w:val="12"/>
-  </w:num>
-  <w:num w:numId="13">
-    <w:abstractNumId w:val="7"/>
-  </w:num>
-  <w:num w:numId="14">
-    <w:abstractNumId w:val="9"/>
-  </w:num>
-  <w:num w:numId="15">
-    <w:abstractNumId w:val="8"/>
-  </w:num>
-  <w:num w:numId="16">
-    <w:abstractNumId w:val="6"/>
-  </w:num>
-  <w:num w:numId="17">
-    <w:abstractNumId w:val="14"/>
   </w:num>
 </w:numbering>
 </file>
 
 <file path=word/styles.xml><?xml version="1.0" encoding="utf-8"?>
-<w:styles xmlns:mc="http://schemas.openxmlformats.org/markup-compatibility/2006" xmlns:r="http://schemas.openxmlformats.org/officeDocument/2006/relationships" xmlns:w="http://schemas.openxmlformats.org/wordprocessingml/2006/main" xmlns:w14="http://schemas.microsoft.com/office/word/2010/wordml" xmlns:w15="http://schemas.microsoft.com/office/word/2012/wordml" xmlns:w16se="http://schemas.microsoft.com/office/word/2015/wordml/symex" mc:Ignorable="w14 w15 w16se">
+<w:styles xmlns:mc="http://schemas.openxmlformats.org/markup-compatibility/2006" xmlns:r="http://schemas.openxmlformats.org/officeDocument/2006/relationships" xmlns:w="http://schemas.openxmlformats.org/wordprocessingml/2006/main" xmlns:w14="http://schemas.microsoft.com/office/word/2010/wordml" xmlns:w15="http://schemas.microsoft.com/office/word/2012/wordml" xmlns:w16cex="http://schemas.microsoft.com/office/word/2018/wordml/cex" xmlns:w16cid="http://schemas.microsoft.com/office/word/2016/wordml/cid" xmlns:w16="http://schemas.microsoft.com/office/word/2018/wordml" xmlns:w16du="http://schemas.microsoft.com/office/word/2023/wordml/word16du" xmlns:w16sdtdh="http://schemas.microsoft.com/office/word/2020/wordml/sdtdatahash" xmlns:w16sdtfl="http://schemas.microsoft.com/office/word/2024/wordml/sdtformatlock" xmlns:w16se="http://schemas.microsoft.com/office/word/2015/wordml/symex" mc:Ignorable="w14 w15 w16se w16cid w16 w16cex w16sdtdh w16sdtfl w16du">
   <w:docDefaults>
     <w:rPrDefault>
       <w:rPr>
@@ -4407,7 +3819,7 @@
       </w:pPr>
     </w:pPrDefault>
   </w:docDefaults>
-  <w:latentStyles w:defLockedState="0" w:defUIPriority="99" w:defSemiHidden="0" w:defUnhideWhenUsed="0" w:defQFormat="0" w:count="371">
+  <w:latentStyles w:defLockedState="0" w:defUIPriority="99" w:defSemiHidden="0" w:defUnhideWhenUsed="0" w:defQFormat="0" w:count="376">
     <w:lsdException w:name="Normal" w:uiPriority="0" w:qFormat="1"/>
     <w:lsdException w:name="heading 1" w:uiPriority="9" w:qFormat="1"/>
     <w:lsdException w:name="heading 2" w:semiHidden="1" w:uiPriority="9" w:unhideWhenUsed="1" w:qFormat="1"/>
@@ -4779,6 +4191,11 @@
     <w:lsdException w:name="List Table 5 Dark Accent 6" w:uiPriority="50"/>
     <w:lsdException w:name="List Table 6 Colorful Accent 6" w:uiPriority="51"/>
     <w:lsdException w:name="List Table 7 Colorful Accent 6" w:uiPriority="52"/>
+    <w:lsdException w:name="Mention" w:semiHidden="1" w:unhideWhenUsed="1"/>
+    <w:lsdException w:name="Smart Hyperlink" w:semiHidden="1" w:unhideWhenUsed="1"/>
+    <w:lsdException w:name="Hashtag" w:semiHidden="1" w:unhideWhenUsed="1"/>
+    <w:lsdException w:name="Unresolved Mention" w:semiHidden="1" w:unhideWhenUsed="1"/>
+    <w:lsdException w:name="Smart Link" w:semiHidden="1" w:unhideWhenUsed="1"/>
   </w:latentStyles>
   <w:style w:type="paragraph" w:default="1" w:styleId="a">
     <w:name w:val="Normal"/>

</xml_diff>